<commit_message>
Update User Documentation for Adaptive Snapshot Cleanup Workflow
- Revised document structure and formatting for clarity.
- Updated audience information and preparation date.
- Clarified workflow functionality and operational details.
- Enhanced descriptions of log outputs and run summaries.
- Improved explanations of snapshot filtering and opt-out mechanisms.
- Added sections on troubleshooting, FAQs, and quick reference for operators.
- Streamlined language for better readability and comprehension.
</commit_message>
<xml_diff>
--- a/OrchestratorWorkflows/vCenter/vms/snapshots/Documentation/02_Design_Document.docx
+++ b/OrchestratorWorkflows/vCenter/vms/snapshots/Documentation/02_Design_Document.docx
@@ -4,393 +4,226 @@
   <w:body>
     <w:p>
       <w:pPr>
+        <w:spacing w:after="0"/>
+      </w:pPr>
+      <w:r>
+        <w:t xml:space="preserve"> </w:t>
+      </w:r>
+    </w:p>
+    <w:p>
+      <w:pPr>
+        <w:spacing w:after="0"/>
+      </w:pPr>
+      <w:r>
+        <w:t xml:space="preserve"> </w:t>
+      </w:r>
+    </w:p>
+    <w:p>
+      <w:pPr>
+        <w:spacing w:after="0"/>
+      </w:pPr>
+      <w:r>
+        <w:t xml:space="preserve"> </w:t>
+      </w:r>
+    </w:p>
+    <w:p>
+      <w:pPr>
+        <w:spacing w:after="0"/>
+      </w:pPr>
+      <w:r>
+        <w:t xml:space="preserve"> </w:t>
+      </w:r>
+    </w:p>
+    <w:p>
+      <w:pPr>
+        <w:spacing w:after="200"/>
+        <w:jc w:val="center"/>
+      </w:pPr>
+      <w:r>
+        <w:drawing>
+          <wp:inline distT="0" distB="0" distL="0" distR="0">
+            <wp:extent cx="5715000" cy="3219450"/>
+            <wp:effectExtent t="0" r="0" b="0" l="0"/>
+            <wp:docPr id="1" name="cover" descr="Private Cloud Operations banner" title="Cover"/>
+            <wp:cNvGraphicFramePr>
+              <a:graphicFrameLocks xmlns:a="http://schemas.openxmlformats.org/drawingml/2006/main" noChangeAspect="1"/>
+            </wp:cNvGraphicFramePr>
+            <a:graphic xmlns:a="http://schemas.openxmlformats.org/drawingml/2006/main">
+              <a:graphicData uri="http://schemas.openxmlformats.org/drawingml/2006/picture">
+                <pic:pic xmlns:pic="http://schemas.openxmlformats.org/drawingml/2006/picture">
+                  <pic:nvPicPr>
+                    <pic:cNvPr id="0" name="" descr=""/>
+                    <pic:cNvPicPr>
+                      <a:picLocks noChangeAspect="1" noChangeArrowheads="1"/>
+                    </pic:cNvPicPr>
+                  </pic:nvPicPr>
+                  <pic:blipFill>
+                    <a:blip r:embed="rId9" cstate="none"/>
+                    <a:srcRect/>
+                    <a:stretch>
+                      <a:fillRect/>
+                    </a:stretch>
+                  </pic:blipFill>
+                  <pic:spPr bwMode="auto">
+                    <a:xfrm>
+                      <a:off x="0" y="0"/>
+                      <a:ext cx="5715000" cy="3219450"/>
+                    </a:xfrm>
+                    <a:prstGeom prst="rect">
+                      <a:avLst/>
+                    </a:prstGeom>
+                  </pic:spPr>
+                </pic:pic>
+              </a:graphicData>
+            </a:graphic>
+          </wp:inline>
+        </w:drawing>
+      </w:r>
+    </w:p>
+    <w:p>
+      <w:pPr>
+        <w:spacing w:after="80"/>
+        <w:jc w:val="center"/>
+      </w:pPr>
+      <w:r>
+        <w:rPr>
+          <w:rFonts w:ascii="Arial" w:cs="Arial" w:eastAsia="Arial" w:hAnsi="Arial"/>
+          <w:b/>
+          <w:bCs/>
+          <w:color w:val="5BA3E8"/>
+          <w:sz w:val="20"/>
+          <w:szCs w:val="20"/>
+        </w:rPr>
+        <w:t xml:space="preserve">TECHNICAL ADVISORY  ·  PRIVATE CLOUD OPERATIONS</w:t>
+      </w:r>
+    </w:p>
+    <w:p>
+      <w:pPr>
+        <w:spacing w:after="60"/>
+        <w:jc w:val="center"/>
+      </w:pPr>
+      <w:r>
+        <w:rPr>
+          <w:rFonts w:ascii="Arial" w:cs="Arial" w:eastAsia="Arial" w:hAnsi="Arial"/>
+          <w:b/>
+          <w:bCs/>
+          <w:color w:val="0A1F3D"/>
+          <w:sz w:val="48"/>
+          <w:szCs w:val="48"/>
+        </w:rPr>
+        <w:t xml:space="preserve">Adaptive Snapshot Cleanup</w:t>
+      </w:r>
+    </w:p>
+    <w:p>
+      <w:pPr>
         <w:spacing w:after="120"/>
-      </w:pPr>
-      <w:r>
+        <w:jc w:val="center"/>
+      </w:pPr>
+      <w:r>
+        <w:rPr>
+          <w:rFonts w:ascii="Arial" w:cs="Arial" w:eastAsia="Arial" w:hAnsi="Arial"/>
+          <w:b/>
+          <w:bCs/>
+          <w:color w:val="1565C0"/>
+          <w:sz w:val="30"/>
+          <w:szCs w:val="30"/>
+        </w:rPr>
+        <w:t xml:space="preserve">VCF 9.0.2 / VCF Automation 9.0.2</w:t>
+      </w:r>
+    </w:p>
+    <w:p>
+      <w:pPr>
+        <w:spacing w:after="0"/>
+      </w:pPr>
+      <w:r>
+        <w:rPr>
+          <w:sz w:val="22"/>
+          <w:szCs w:val="22"/>
+        </w:rPr>
         <w:t xml:space="preserve"> </w:t>
       </w:r>
     </w:p>
     <w:p>
       <w:pPr>
-        <w:spacing w:after="120"/>
-      </w:pPr>
-      <w:r>
-        <w:t xml:space="preserve"> </w:t>
-      </w:r>
-    </w:p>
-    <w:p>
-      <w:pPr>
-        <w:spacing w:after="120"/>
-      </w:pPr>
-      <w:r>
-        <w:t xml:space="preserve"> </w:t>
-      </w:r>
-    </w:p>
-    <w:p>
-      <w:pPr>
-        <w:spacing w:after="120"/>
-      </w:pPr>
-      <w:r>
-        <w:t xml:space="preserve"> </w:t>
-      </w:r>
-    </w:p>
-    <w:p>
-      <w:pPr>
-        <w:pStyle w:val="Title"/>
-        <w:spacing w:after="60"/>
-      </w:pPr>
-      <w:r>
-        <w:t xml:space="preserve">Adaptive Snapshot Cleanup</w:t>
-      </w:r>
-    </w:p>
-    <w:p>
-      <w:pPr>
-        <w:pStyle w:val="Subtitle"/>
-      </w:pPr>
-      <w:r>
+        <w:pBdr>
+          <w:bottom w:val="single" w:color="1565C0" w:sz="18" w:space="4"/>
+        </w:pBdr>
+        <w:spacing w:after="200"/>
+        <w:jc w:val="center"/>
+      </w:pPr>
+    </w:p>
+    <w:p>
+      <w:pPr>
+        <w:spacing w:after="200"/>
+        <w:jc w:val="center"/>
+      </w:pPr>
+      <w:r>
+        <w:rPr>
+          <w:rFonts w:ascii="Arial" w:cs="Arial" w:eastAsia="Arial" w:hAnsi="Arial"/>
+          <w:i/>
+          <w:iCs/>
+          <w:color w:val="404040"/>
+          <w:sz w:val="24"/>
+          <w:szCs w:val="24"/>
+        </w:rPr>
         <w:t xml:space="preserve">Design Document</w:t>
       </w:r>
     </w:p>
     <w:p>
       <w:pPr>
-        <w:pBdr>
-          <w:bottom w:val="single" w:color="2E75B6" w:sz="18" w:space="6"/>
-        </w:pBdr>
-        <w:spacing w:after="360"/>
-      </w:pPr>
-    </w:p>
-    <w:tbl>
-      <w:tblPr>
-        <w:tblW w:type="dxa" w:w="9360"/>
-        <w:tblBorders>
-          <w:top w:val="single" w:color="auto" w:sz="4"/>
-          <w:left w:val="single" w:color="auto" w:sz="4"/>
-          <w:bottom w:val="single" w:color="auto" w:sz="4"/>
-          <w:right w:val="single" w:color="auto" w:sz="4"/>
-          <w:insideH w:val="single" w:color="auto" w:sz="4"/>
-          <w:insideV w:val="single" w:color="auto" w:sz="4"/>
-        </w:tblBorders>
-      </w:tblPr>
-      <w:tblGrid>
-        <w:gridCol w:w="2400"/>
-        <w:gridCol w:w="6960"/>
-      </w:tblGrid>
-      <w:tr>
-        <w:tc>
-          <w:tcPr>
-            <w:tcW w:type="dxa" w:w="2400"/>
-            <w:tcBorders>
-              <w:top w:val="none"/>
-              <w:left w:val="none"/>
-              <w:bottom w:val="none"/>
-              <w:right w:val="none"/>
-            </w:tcBorders>
-            <w:tcMar>
-              <w:top w:type="dxa" w:w="60"/>
-              <w:left w:type="dxa" w:w="0"/>
-              <w:bottom w:type="dxa" w:w="60"/>
-              <w:right w:type="dxa" w:w="100"/>
-            </w:tcMar>
-          </w:tcPr>
-          <w:p>
-            <w:pPr>
-              <w:spacing w:after="0"/>
-            </w:pPr>
-            <w:r>
-              <w:rPr>
-                <w:b/>
-                <w:bCs/>
-                <w:color w:val="595959"/>
-                <w:sz w:val="20"/>
-                <w:szCs w:val="20"/>
-              </w:rPr>
-              <w:t xml:space="preserve">Platform</w:t>
-            </w:r>
-          </w:p>
-        </w:tc>
-        <w:tc>
-          <w:tcPr>
-            <w:tcW w:type="dxa" w:w="6960"/>
-            <w:tcBorders>
-              <w:top w:val="none"/>
-              <w:left w:val="none"/>
-              <w:bottom w:val="none"/>
-              <w:right w:val="none"/>
-            </w:tcBorders>
-            <w:tcMar>
-              <w:top w:type="dxa" w:w="60"/>
-              <w:left w:type="dxa" w:w="0"/>
-              <w:bottom w:type="dxa" w:w="60"/>
-              <w:right w:type="dxa" w:w="0"/>
-            </w:tcMar>
-          </w:tcPr>
-          <w:p>
-            <w:pPr>
-              <w:spacing w:after="0"/>
-            </w:pPr>
-            <w:r>
-              <w:rPr>
-                <w:sz w:val="20"/>
-                <w:szCs w:val="20"/>
-              </w:rPr>
-              <w:t xml:space="preserve">VMware Cloud Foundation 9.0.2 / Embedded vRO 8.17.x</w:t>
-            </w:r>
-          </w:p>
-        </w:tc>
-      </w:tr>
-      <w:tr>
-        <w:tc>
-          <w:tcPr>
-            <w:tcW w:type="dxa" w:w="2400"/>
-            <w:tcBorders>
-              <w:top w:val="none"/>
-              <w:left w:val="none"/>
-              <w:bottom w:val="none"/>
-              <w:right w:val="none"/>
-            </w:tcBorders>
-            <w:tcMar>
-              <w:top w:type="dxa" w:w="60"/>
-              <w:left w:type="dxa" w:w="0"/>
-              <w:bottom w:type="dxa" w:w="60"/>
-              <w:right w:type="dxa" w:w="100"/>
-            </w:tcMar>
-          </w:tcPr>
-          <w:p>
-            <w:pPr>
-              <w:spacing w:after="0"/>
-            </w:pPr>
-            <w:r>
-              <w:rPr>
-                <w:b/>
-                <w:bCs/>
-                <w:color w:val="595959"/>
-                <w:sz w:val="20"/>
-                <w:szCs w:val="20"/>
-              </w:rPr>
-              <w:t xml:space="preserve">Document</w:t>
-            </w:r>
-          </w:p>
-        </w:tc>
-        <w:tc>
-          <w:tcPr>
-            <w:tcW w:type="dxa" w:w="6960"/>
-            <w:tcBorders>
-              <w:top w:val="none"/>
-              <w:left w:val="none"/>
-              <w:bottom w:val="none"/>
-              <w:right w:val="none"/>
-            </w:tcBorders>
-            <w:tcMar>
-              <w:top w:type="dxa" w:w="60"/>
-              <w:left w:type="dxa" w:w="0"/>
-              <w:bottom w:type="dxa" w:w="60"/>
-              <w:right w:type="dxa" w:w="0"/>
-            </w:tcMar>
-          </w:tcPr>
-          <w:p>
-            <w:pPr>
-              <w:spacing w:after="0"/>
-            </w:pPr>
-            <w:r>
-              <w:rPr>
-                <w:sz w:val="20"/>
-                <w:szCs w:val="20"/>
-              </w:rPr>
-              <w:t xml:space="preserve">Design Document</w:t>
-            </w:r>
-          </w:p>
-        </w:tc>
-      </w:tr>
-      <w:tr>
-        <w:tc>
-          <w:tcPr>
-            <w:tcW w:type="dxa" w:w="2400"/>
-            <w:tcBorders>
-              <w:top w:val="none"/>
-              <w:left w:val="none"/>
-              <w:bottom w:val="none"/>
-              <w:right w:val="none"/>
-            </w:tcBorders>
-            <w:tcMar>
-              <w:top w:type="dxa" w:w="60"/>
-              <w:left w:type="dxa" w:w="0"/>
-              <w:bottom w:type="dxa" w:w="60"/>
-              <w:right w:type="dxa" w:w="100"/>
-            </w:tcMar>
-          </w:tcPr>
-          <w:p>
-            <w:pPr>
-              <w:spacing w:after="0"/>
-            </w:pPr>
-            <w:r>
-              <w:rPr>
-                <w:b/>
-                <w:bCs/>
-                <w:color w:val="595959"/>
-                <w:sz w:val="20"/>
-                <w:szCs w:val="20"/>
-              </w:rPr>
-              <w:t xml:space="preserve">Audience</w:t>
-            </w:r>
-          </w:p>
-        </w:tc>
-        <w:tc>
-          <w:tcPr>
-            <w:tcW w:type="dxa" w:w="6960"/>
-            <w:tcBorders>
-              <w:top w:val="none"/>
-              <w:left w:val="none"/>
-              <w:bottom w:val="none"/>
-              <w:right w:val="none"/>
-            </w:tcBorders>
-            <w:tcMar>
-              <w:top w:type="dxa" w:w="60"/>
-              <w:left w:type="dxa" w:w="0"/>
-              <w:bottom w:type="dxa" w:w="60"/>
-              <w:right w:type="dxa" w:w="0"/>
-            </w:tcMar>
-          </w:tcPr>
-          <w:p>
-            <w:pPr>
-              <w:spacing w:after="0"/>
-            </w:pPr>
-            <w:r>
-              <w:rPr>
-                <w:sz w:val="20"/>
-                <w:szCs w:val="20"/>
-              </w:rPr>
-              <w:t xml:space="preserve">vRO Architects, Platform Engineers</w:t>
-            </w:r>
-          </w:p>
-        </w:tc>
-      </w:tr>
-      <w:tr>
-        <w:tc>
-          <w:tcPr>
-            <w:tcW w:type="dxa" w:w="2400"/>
-            <w:tcBorders>
-              <w:top w:val="none"/>
-              <w:left w:val="none"/>
-              <w:bottom w:val="none"/>
-              <w:right w:val="none"/>
-            </w:tcBorders>
-            <w:tcMar>
-              <w:top w:type="dxa" w:w="60"/>
-              <w:left w:type="dxa" w:w="0"/>
-              <w:bottom w:type="dxa" w:w="60"/>
-              <w:right w:type="dxa" w:w="100"/>
-            </w:tcMar>
-          </w:tcPr>
-          <w:p>
-            <w:pPr>
-              <w:spacing w:after="0"/>
-            </w:pPr>
-            <w:r>
-              <w:rPr>
-                <w:b/>
-                <w:bCs/>
-                <w:color w:val="595959"/>
-                <w:sz w:val="20"/>
-                <w:szCs w:val="20"/>
-              </w:rPr>
-              <w:t xml:space="preserve">Status</w:t>
-            </w:r>
-          </w:p>
-        </w:tc>
-        <w:tc>
-          <w:tcPr>
-            <w:tcW w:type="dxa" w:w="6960"/>
-            <w:tcBorders>
-              <w:top w:val="none"/>
-              <w:left w:val="none"/>
-              <w:bottom w:val="none"/>
-              <w:right w:val="none"/>
-            </w:tcBorders>
-            <w:tcMar>
-              <w:top w:type="dxa" w:w="60"/>
-              <w:left w:type="dxa" w:w="0"/>
-              <w:bottom w:type="dxa" w:w="60"/>
-              <w:right w:type="dxa" w:w="0"/>
-            </w:tcMar>
-          </w:tcPr>
-          <w:p>
-            <w:pPr>
-              <w:spacing w:after="0"/>
-            </w:pPr>
-            <w:r>
-              <w:rPr>
-                <w:sz w:val="20"/>
-                <w:szCs w:val="20"/>
-              </w:rPr>
-              <w:t xml:space="preserve">Release Candidate</w:t>
-            </w:r>
-          </w:p>
-        </w:tc>
-      </w:tr>
-      <w:tr>
-        <w:tc>
-          <w:tcPr>
-            <w:tcW w:type="dxa" w:w="2400"/>
-            <w:tcBorders>
-              <w:top w:val="none"/>
-              <w:left w:val="none"/>
-              <w:bottom w:val="none"/>
-              <w:right w:val="none"/>
-            </w:tcBorders>
-            <w:tcMar>
-              <w:top w:type="dxa" w:w="60"/>
-              <w:left w:type="dxa" w:w="0"/>
-              <w:bottom w:type="dxa" w:w="60"/>
-              <w:right w:type="dxa" w:w="100"/>
-            </w:tcMar>
-          </w:tcPr>
-          <w:p>
-            <w:pPr>
-              <w:spacing w:after="0"/>
-            </w:pPr>
-            <w:r>
-              <w:rPr>
-                <w:b/>
-                <w:bCs/>
-                <w:color w:val="595959"/>
-                <w:sz w:val="20"/>
-                <w:szCs w:val="20"/>
-              </w:rPr>
-              <w:t xml:space="preserve">Version</w:t>
-            </w:r>
-          </w:p>
-        </w:tc>
-        <w:tc>
-          <w:tcPr>
-            <w:tcW w:type="dxa" w:w="6960"/>
-            <w:tcBorders>
-              <w:top w:val="none"/>
-              <w:left w:val="none"/>
-              <w:bottom w:val="none"/>
-              <w:right w:val="none"/>
-            </w:tcBorders>
-            <w:tcMar>
-              <w:top w:type="dxa" w:w="60"/>
-              <w:left w:type="dxa" w:w="0"/>
-              <w:bottom w:type="dxa" w:w="60"/>
-              <w:right w:type="dxa" w:w="0"/>
-            </w:tcMar>
-          </w:tcPr>
-          <w:p>
-            <w:pPr>
-              <w:spacing w:after="0"/>
-            </w:pPr>
-            <w:r>
-              <w:rPr>
-                <w:sz w:val="20"/>
-                <w:szCs w:val="20"/>
-              </w:rPr>
-              <w:t xml:space="preserve">1.0</w:t>
-            </w:r>
-          </w:p>
-        </w:tc>
-      </w:tr>
-    </w:tbl>
+        <w:spacing w:after="0"/>
+        <w:jc w:val="center"/>
+      </w:pPr>
+      <w:r>
+        <w:rPr>
+          <w:rFonts w:ascii="Arial" w:cs="Arial" w:eastAsia="Arial" w:hAnsi="Arial"/>
+          <w:b/>
+          <w:bCs/>
+          <w:color w:val="404040"/>
+          <w:sz w:val="18"/>
+          <w:szCs w:val="18"/>
+        </w:rPr>
+        <w:t xml:space="preserve">PREPARED:  </w:t>
+      </w:r>
+      <w:r>
+        <w:rPr>
+          <w:rFonts w:ascii="Arial" w:cs="Arial" w:eastAsia="Arial" w:hAnsi="Arial"/>
+          <w:color w:val="707070"/>
+          <w:sz w:val="18"/>
+          <w:szCs w:val="18"/>
+        </w:rPr>
+        <w:t xml:space="preserve">April 2026</w:t>
+      </w:r>
+      <w:r>
+        <w:rPr>
+          <w:rFonts w:ascii="Arial" w:cs="Arial" w:eastAsia="Arial" w:hAnsi="Arial"/>
+          <w:color w:val="404040"/>
+          <w:sz w:val="18"/>
+          <w:szCs w:val="18"/>
+        </w:rPr>
+        <w:t xml:space="preserve">       ·       </w:t>
+      </w:r>
+      <w:r>
+        <w:rPr>
+          <w:rFonts w:ascii="Arial" w:cs="Arial" w:eastAsia="Arial" w:hAnsi="Arial"/>
+          <w:b/>
+          <w:bCs/>
+          <w:color w:val="404040"/>
+          <w:sz w:val="18"/>
+          <w:szCs w:val="18"/>
+        </w:rPr>
+        <w:t xml:space="preserve">AUDIENCE:  </w:t>
+      </w:r>
+      <w:r>
+        <w:rPr>
+          <w:rFonts w:ascii="Arial" w:cs="Arial" w:eastAsia="Arial" w:hAnsi="Arial"/>
+          <w:color w:val="707070"/>
+          <w:sz w:val="18"/>
+          <w:szCs w:val="18"/>
+        </w:rPr>
+        <w:t xml:space="preserve">Department of State, DT/EI/IM/CVS, IT Leadership, Infrastructure Management</w:t>
+      </w:r>
+    </w:p>
     <w:p>
       <w:r>
         <w:br w:type="page"/>
@@ -462,6 +295,19 @@
       </w:pPr>
       <w:r>
         <w:t xml:space="preserve">Default to dry-run so accidental scheduling cannot cause unintended deletion.</w:t>
+      </w:r>
+    </w:p>
+    <w:p>
+      <w:pPr>
+        <w:pStyle w:val="ListParagraph"/>
+        <w:numPr>
+          <w:ilvl w:val="0"/>
+          <w:numId w:val="2"/>
+        </w:numPr>
+        <w:spacing w:after="80"/>
+      </w:pPr>
+      <w:r>
+        <w:t xml:space="preserve">Support multiple description-ignore strings so different teams and tooling can independently opt their snapshots out of cleanup without coordinating on a single keyword.</w:t>
       </w:r>
     </w:p>
     <w:p>
@@ -591,7 +437,7 @@
               <w:bottom w:val="single" w:color="BFBFBF" w:sz="4"/>
               <w:right w:val="single" w:color="BFBFBF" w:sz="4"/>
             </w:tcBorders>
-            <w:shd w:fill="1F3864" w:val="clear"/>
+            <w:shd w:fill="0A1F3D" w:val="clear"/>
             <w:tcMar>
               <w:top w:type="dxa" w:w="100"/>
               <w:left w:type="dxa" w:w="140"/>
@@ -605,11 +451,12 @@
             </w:pPr>
             <w:r>
               <w:rPr>
+                <w:rFonts w:ascii="Arial" w:cs="Arial" w:eastAsia="Arial" w:hAnsi="Arial"/>
                 <w:b/>
                 <w:bCs/>
                 <w:color w:val="FFFFFF"/>
-                <w:sz w:val="22"/>
-                <w:szCs w:val="22"/>
+                <w:sz w:val="20"/>
+                <w:szCs w:val="20"/>
               </w:rPr>
               <w:t xml:space="preserve">ID</w:t>
             </w:r>
@@ -624,7 +471,7 @@
               <w:bottom w:val="single" w:color="BFBFBF" w:sz="4"/>
               <w:right w:val="single" w:color="BFBFBF" w:sz="4"/>
             </w:tcBorders>
-            <w:shd w:fill="1F3864" w:val="clear"/>
+            <w:shd w:fill="0A1F3D" w:val="clear"/>
             <w:tcMar>
               <w:top w:type="dxa" w:w="100"/>
               <w:left w:type="dxa" w:w="140"/>
@@ -638,11 +485,12 @@
             </w:pPr>
             <w:r>
               <w:rPr>
+                <w:rFonts w:ascii="Arial" w:cs="Arial" w:eastAsia="Arial" w:hAnsi="Arial"/>
                 <w:b/>
                 <w:bCs/>
                 <w:color w:val="FFFFFF"/>
-                <w:sz w:val="22"/>
-                <w:szCs w:val="22"/>
+                <w:sz w:val="20"/>
+                <w:szCs w:val="20"/>
               </w:rPr>
               <w:t xml:space="preserve">Task</w:t>
             </w:r>
@@ -657,7 +505,7 @@
               <w:bottom w:val="single" w:color="BFBFBF" w:sz="4"/>
               <w:right w:val="single" w:color="BFBFBF" w:sz="4"/>
             </w:tcBorders>
-            <w:shd w:fill="1F3864" w:val="clear"/>
+            <w:shd w:fill="0A1F3D" w:val="clear"/>
             <w:tcMar>
               <w:top w:type="dxa" w:w="100"/>
               <w:left w:type="dxa" w:w="140"/>
@@ -671,11 +519,12 @@
             </w:pPr>
             <w:r>
               <w:rPr>
+                <w:rFonts w:ascii="Arial" w:cs="Arial" w:eastAsia="Arial" w:hAnsi="Arial"/>
                 <w:b/>
                 <w:bCs/>
                 <w:color w:val="FFFFFF"/>
-                <w:sz w:val="22"/>
-                <w:szCs w:val="22"/>
+                <w:sz w:val="20"/>
+                <w:szCs w:val="20"/>
               </w:rPr>
               <w:t xml:space="preserve">Responsibility</w:t>
             </w:r>
@@ -769,7 +618,7 @@
                 <w:sz w:val="20"/>
                 <w:szCs w:val="20"/>
               </w:rPr>
-              <w:t xml:space="preserve">Generate a unique run ID (SCR-YYYY-MM-DDTHH-MM-SS), normalise human-readable input thresholds into internal units (bytes, ms), initialise the runLog accumulator.</w:t>
+              <w:t xml:space="preserve">Generate a unique run ID (SCR-YYYY-MM-DDTHH-MM-SS), normalise human-readable input thresholds into internal units (bytes, ms), initialise the runLog accumulator. Logs the active descIgnoreStrings array for traceability.</w:t>
             </w:r>
           </w:p>
         </w:tc>
@@ -953,7 +802,7 @@
                 <w:sz w:val="20"/>
                 <w:szCs w:val="20"/>
               </w:rPr>
-              <w:t xml:space="preserve">Iterate VcPlugin.allSdkConnections; for each, call _getSnapshotCandidates and merge results into a single flat array. Per-vCenter failures are isolated as enum_error log entries; they do not abort the run.</w:t>
+              <w:t xml:space="preserve">Iterate VcPlugin.allSdkConnections; for each, call _getSnapshotCandidates and merge results into a single flat array. Per-vCenter failures are isolated as enum_error log entries; they do not abort the run. The descIgnoreStrings array is passed to _getSnapshotCandidates for evaluation against each snapshot description.</w:t>
             </w:r>
           </w:p>
         </w:tc>
@@ -1505,7 +1354,7 @@
                 <w:sz w:val="20"/>
                 <w:szCs w:val="20"/>
               </w:rPr>
-              <w:t xml:space="preserve">Always-executes terminal task. Releases the lock, tallies counts, emits the SNAPSHOT CLEANUP COMPLETE result block, writes the structured runSummaryJson output.</w:t>
+              <w:t xml:space="preserve">Always-executes terminal task. Releases the lock, tallies counts, emits the SNAPSHOT CLEANUP COMPLETE result block, writes the structured runSummaryJson output including the active descIgnoreStrings array.</w:t>
             </w:r>
           </w:p>
         </w:tc>
@@ -1605,7 +1454,7 @@
     </w:tbl>
     <w:p>
       <w:pPr>
-        <w:spacing w:after="120"/>
+        <w:spacing w:after="60"/>
       </w:pPr>
       <w:r>
         <w:t xml:space="preserve"> </w:t>
@@ -1648,7 +1497,7 @@
               <w:bottom w:val="single" w:color="BFBFBF" w:sz="4"/>
               <w:right w:val="single" w:color="BFBFBF" w:sz="4"/>
             </w:tcBorders>
-            <w:shd w:fill="1F3864" w:val="clear"/>
+            <w:shd w:fill="0A1F3D" w:val="clear"/>
             <w:tcMar>
               <w:top w:type="dxa" w:w="100"/>
               <w:left w:type="dxa" w:w="140"/>
@@ -1662,11 +1511,12 @@
             </w:pPr>
             <w:r>
               <w:rPr>
+                <w:rFonts w:ascii="Arial" w:cs="Arial" w:eastAsia="Arial" w:hAnsi="Arial"/>
                 <w:b/>
                 <w:bCs/>
                 <w:color w:val="FFFFFF"/>
-                <w:sz w:val="22"/>
-                <w:szCs w:val="22"/>
+                <w:sz w:val="20"/>
+                <w:szCs w:val="20"/>
               </w:rPr>
               <w:t xml:space="preserve">Module</w:t>
             </w:r>
@@ -1681,7 +1531,7 @@
               <w:bottom w:val="single" w:color="BFBFBF" w:sz="4"/>
               <w:right w:val="single" w:color="BFBFBF" w:sz="4"/>
             </w:tcBorders>
-            <w:shd w:fill="1F3864" w:val="clear"/>
+            <w:shd w:fill="0A1F3D" w:val="clear"/>
             <w:tcMar>
               <w:top w:type="dxa" w:w="100"/>
               <w:left w:type="dxa" w:w="140"/>
@@ -1695,11 +1545,12 @@
             </w:pPr>
             <w:r>
               <w:rPr>
+                <w:rFonts w:ascii="Arial" w:cs="Arial" w:eastAsia="Arial" w:hAnsi="Arial"/>
                 <w:b/>
                 <w:bCs/>
                 <w:color w:val="FFFFFF"/>
-                <w:sz w:val="22"/>
-                <w:szCs w:val="22"/>
+                <w:sz w:val="20"/>
+                <w:szCs w:val="20"/>
               </w:rPr>
               <w:t xml:space="preserve">Actions</w:t>
             </w:r>
@@ -1763,7 +1614,7 @@
                 <w:sz w:val="20"/>
                 <w:szCs w:val="20"/>
               </w:rPr>
-              <w:t xml:space="preserve">_getSnapshotCandidates, _deleteSnapshot — VM and snapshot enumeration and deletion. Operate against VC:SdkConnection objects through the vRO inventory tree (no REST, no MoRef construction).</w:t>
+              <w:t xml:space="preserve">_getSnapshotCandidates — accepts a descIgnoreStrings array and evaluates each snapshot description against every element. _deleteSnapshot — VM and snapshot enumeration and deletion. Both operate against VC:SdkConnection objects through the vRO inventory tree (no REST, no MoRef construction).</w:t>
             </w:r>
           </w:p>
         </w:tc>
@@ -1833,7 +1684,7 @@
     </w:tbl>
     <w:p>
       <w:pPr>
-        <w:spacing w:after="120"/>
+        <w:spacing w:after="60"/>
       </w:pPr>
       <w:r>
         <w:t xml:space="preserve"> </w:t>
@@ -1907,7 +1758,6 @@
               <w:rPr>
                 <w:b/>
                 <w:bCs/>
-                <w:color w:val="1F1F1F"/>
                 <w:sz w:val="22"/>
                 <w:szCs w:val="22"/>
               </w:rPr>
@@ -1947,8 +1797,8 @@
       <w:r>
         <w:rPr>
           <w:rFonts w:ascii="Consolas" w:cs="Consolas" w:eastAsia="Consolas" w:hAnsi="Consolas"/>
-          <w:sz w:val="22"/>
-          <w:szCs w:val="22"/>
+          <w:sz w:val="20"/>
+          <w:szCs w:val="20"/>
         </w:rPr>
         <w:t xml:space="preserve">SnapshotCleanup</w:t>
       </w:r>
@@ -1966,7 +1816,7 @@
         <w:t xml:space="preserve">RuntimeState</w:t>
       </w:r>
       <w:r>
-        <w:t xml:space="preserve">. All threshold and policy values are workflow input parameters, set as defaults on the workflow Inputs tab and overridable per schedule. There is no separate file-logging configuration; all audit output goes to the vRO workflow log.</w:t>
+        <w:t xml:space="preserve">. All threshold and policy values are workflow input parameters, set as defaults on the workflow Inputs tab and overridable per schedule.</w:t>
       </w:r>
     </w:p>
     <w:p>
@@ -2007,7 +1857,7 @@
               <w:bottom w:val="single" w:color="BFBFBF" w:sz="4"/>
               <w:right w:val="single" w:color="BFBFBF" w:sz="4"/>
             </w:tcBorders>
-            <w:shd w:fill="1F3864" w:val="clear"/>
+            <w:shd w:fill="0A1F3D" w:val="clear"/>
             <w:tcMar>
               <w:top w:type="dxa" w:w="100"/>
               <w:left w:type="dxa" w:w="140"/>
@@ -2021,11 +1871,12 @@
             </w:pPr>
             <w:r>
               <w:rPr>
+                <w:rFonts w:ascii="Arial" w:cs="Arial" w:eastAsia="Arial" w:hAnsi="Arial"/>
                 <w:b/>
                 <w:bCs/>
                 <w:color w:val="FFFFFF"/>
-                <w:sz w:val="22"/>
-                <w:szCs w:val="22"/>
+                <w:sz w:val="20"/>
+                <w:szCs w:val="20"/>
               </w:rPr>
               <w:t xml:space="preserve">Attribute</w:t>
             </w:r>
@@ -2040,7 +1891,7 @@
               <w:bottom w:val="single" w:color="BFBFBF" w:sz="4"/>
               <w:right w:val="single" w:color="BFBFBF" w:sz="4"/>
             </w:tcBorders>
-            <w:shd w:fill="1F3864" w:val="clear"/>
+            <w:shd w:fill="0A1F3D" w:val="clear"/>
             <w:tcMar>
               <w:top w:type="dxa" w:w="100"/>
               <w:left w:type="dxa" w:w="140"/>
@@ -2054,11 +1905,12 @@
             </w:pPr>
             <w:r>
               <w:rPr>
+                <w:rFonts w:ascii="Arial" w:cs="Arial" w:eastAsia="Arial" w:hAnsi="Arial"/>
                 <w:b/>
                 <w:bCs/>
                 <w:color w:val="FFFFFF"/>
-                <w:sz w:val="22"/>
-                <w:szCs w:val="22"/>
+                <w:sz w:val="20"/>
+                <w:szCs w:val="20"/>
               </w:rPr>
               <w:t xml:space="preserve">Type</w:t>
             </w:r>
@@ -2073,7 +1925,7 @@
               <w:bottom w:val="single" w:color="BFBFBF" w:sz="4"/>
               <w:right w:val="single" w:color="BFBFBF" w:sz="4"/>
             </w:tcBorders>
-            <w:shd w:fill="1F3864" w:val="clear"/>
+            <w:shd w:fill="0A1F3D" w:val="clear"/>
             <w:tcMar>
               <w:top w:type="dxa" w:w="100"/>
               <w:left w:type="dxa" w:w="140"/>
@@ -2087,11 +1939,12 @@
             </w:pPr>
             <w:r>
               <w:rPr>
+                <w:rFonts w:ascii="Arial" w:cs="Arial" w:eastAsia="Arial" w:hAnsi="Arial"/>
                 <w:b/>
                 <w:bCs/>
                 <w:color w:val="FFFFFF"/>
-                <w:sz w:val="22"/>
-                <w:szCs w:val="22"/>
+                <w:sz w:val="20"/>
+                <w:szCs w:val="20"/>
               </w:rPr>
               <w:t xml:space="preserve">Purpose</w:t>
             </w:r>
@@ -2469,7 +2322,7 @@
     </w:tbl>
     <w:p>
       <w:pPr>
-        <w:spacing w:after="120"/>
+        <w:spacing w:after="60"/>
       </w:pPr>
       <w:r>
         <w:t xml:space="preserve"> </w:t>
@@ -2497,9 +2350,9 @@
       </w:tblPr>
       <w:tblGrid>
         <w:gridCol w:w="2400"/>
+        <w:gridCol w:w="1400"/>
         <w:gridCol w:w="1100"/>
-        <w:gridCol w:w="1100"/>
-        <w:gridCol w:w="4760"/>
+        <w:gridCol w:w="4460"/>
       </w:tblGrid>
       <w:tr>
         <w:trPr>
@@ -2514,7 +2367,7 @@
               <w:bottom w:val="single" w:color="BFBFBF" w:sz="4"/>
               <w:right w:val="single" w:color="BFBFBF" w:sz="4"/>
             </w:tcBorders>
-            <w:shd w:fill="1F3864" w:val="clear"/>
+            <w:shd w:fill="0A1F3D" w:val="clear"/>
             <w:tcMar>
               <w:top w:type="dxa" w:w="100"/>
               <w:left w:type="dxa" w:w="140"/>
@@ -2528,11 +2381,12 @@
             </w:pPr>
             <w:r>
               <w:rPr>
+                <w:rFonts w:ascii="Arial" w:cs="Arial" w:eastAsia="Arial" w:hAnsi="Arial"/>
                 <w:b/>
                 <w:bCs/>
                 <w:color w:val="FFFFFF"/>
-                <w:sz w:val="22"/>
-                <w:szCs w:val="22"/>
+                <w:sz w:val="20"/>
+                <w:szCs w:val="20"/>
               </w:rPr>
               <w:t xml:space="preserve">Input</w:t>
             </w:r>
@@ -2540,14 +2394,14 @@
         </w:tc>
         <w:tc>
           <w:tcPr>
-            <w:tcW w:type="dxa" w:w="1100"/>
-            <w:tcBorders>
-              <w:top w:val="single" w:color="BFBFBF" w:sz="4"/>
-              <w:left w:val="single" w:color="BFBFBF" w:sz="4"/>
-              <w:bottom w:val="single" w:color="BFBFBF" w:sz="4"/>
-              <w:right w:val="single" w:color="BFBFBF" w:sz="4"/>
-            </w:tcBorders>
-            <w:shd w:fill="1F3864" w:val="clear"/>
+            <w:tcW w:type="dxa" w:w="1400"/>
+            <w:tcBorders>
+              <w:top w:val="single" w:color="BFBFBF" w:sz="4"/>
+              <w:left w:val="single" w:color="BFBFBF" w:sz="4"/>
+              <w:bottom w:val="single" w:color="BFBFBF" w:sz="4"/>
+              <w:right w:val="single" w:color="BFBFBF" w:sz="4"/>
+            </w:tcBorders>
+            <w:shd w:fill="0A1F3D" w:val="clear"/>
             <w:tcMar>
               <w:top w:type="dxa" w:w="100"/>
               <w:left w:type="dxa" w:w="140"/>
@@ -2561,11 +2415,12 @@
             </w:pPr>
             <w:r>
               <w:rPr>
+                <w:rFonts w:ascii="Arial" w:cs="Arial" w:eastAsia="Arial" w:hAnsi="Arial"/>
                 <w:b/>
                 <w:bCs/>
                 <w:color w:val="FFFFFF"/>
-                <w:sz w:val="22"/>
-                <w:szCs w:val="22"/>
+                <w:sz w:val="20"/>
+                <w:szCs w:val="20"/>
               </w:rPr>
               <w:t xml:space="preserve">Type</w:t>
             </w:r>
@@ -2580,7 +2435,7 @@
               <w:bottom w:val="single" w:color="BFBFBF" w:sz="4"/>
               <w:right w:val="single" w:color="BFBFBF" w:sz="4"/>
             </w:tcBorders>
-            <w:shd w:fill="1F3864" w:val="clear"/>
+            <w:shd w:fill="0A1F3D" w:val="clear"/>
             <w:tcMar>
               <w:top w:type="dxa" w:w="100"/>
               <w:left w:type="dxa" w:w="140"/>
@@ -2594,11 +2449,12 @@
             </w:pPr>
             <w:r>
               <w:rPr>
+                <w:rFonts w:ascii="Arial" w:cs="Arial" w:eastAsia="Arial" w:hAnsi="Arial"/>
                 <w:b/>
                 <w:bCs/>
                 <w:color w:val="FFFFFF"/>
-                <w:sz w:val="22"/>
-                <w:szCs w:val="22"/>
+                <w:sz w:val="20"/>
+                <w:szCs w:val="20"/>
               </w:rPr>
               <w:t xml:space="preserve">Default</w:t>
             </w:r>
@@ -2606,14 +2462,14 @@
         </w:tc>
         <w:tc>
           <w:tcPr>
-            <w:tcW w:type="dxa" w:w="4760"/>
-            <w:tcBorders>
-              <w:top w:val="single" w:color="BFBFBF" w:sz="4"/>
-              <w:left w:val="single" w:color="BFBFBF" w:sz="4"/>
-              <w:bottom w:val="single" w:color="BFBFBF" w:sz="4"/>
-              <w:right w:val="single" w:color="BFBFBF" w:sz="4"/>
-            </w:tcBorders>
-            <w:shd w:fill="1F3864" w:val="clear"/>
+            <w:tcW w:type="dxa" w:w="4460"/>
+            <w:tcBorders>
+              <w:top w:val="single" w:color="BFBFBF" w:sz="4"/>
+              <w:left w:val="single" w:color="BFBFBF" w:sz="4"/>
+              <w:bottom w:val="single" w:color="BFBFBF" w:sz="4"/>
+              <w:right w:val="single" w:color="BFBFBF" w:sz="4"/>
+            </w:tcBorders>
+            <w:shd w:fill="0A1F3D" w:val="clear"/>
             <w:tcMar>
               <w:top w:type="dxa" w:w="100"/>
               <w:left w:type="dxa" w:w="140"/>
@@ -2627,11 +2483,12 @@
             </w:pPr>
             <w:r>
               <w:rPr>
+                <w:rFonts w:ascii="Arial" w:cs="Arial" w:eastAsia="Arial" w:hAnsi="Arial"/>
                 <w:b/>
                 <w:bCs/>
                 <w:color w:val="FFFFFF"/>
-                <w:sz w:val="22"/>
-                <w:szCs w:val="22"/>
+                <w:sz w:val="20"/>
+                <w:szCs w:val="20"/>
               </w:rPr>
               <w:t xml:space="preserve">Notes</w:t>
             </w:r>
@@ -2671,6 +2528,36 @@
         </w:tc>
         <w:tc>
           <w:tcPr>
+            <w:tcW w:type="dxa" w:w="1400"/>
+            <w:tcBorders>
+              <w:top w:val="single" w:color="BFBFBF" w:sz="4"/>
+              <w:left w:val="single" w:color="BFBFBF" w:sz="4"/>
+              <w:bottom w:val="single" w:color="BFBFBF" w:sz="4"/>
+              <w:right w:val="single" w:color="BFBFBF" w:sz="4"/>
+            </w:tcBorders>
+            <w:shd w:fill="FFFFFF" w:val="clear"/>
+            <w:tcMar>
+              <w:top w:type="dxa" w:w="80"/>
+              <w:left w:type="dxa" w:w="140"/>
+              <w:bottom w:type="dxa" w:w="80"/>
+              <w:right w:type="dxa" w:w="140"/>
+            </w:tcMar>
+          </w:tcPr>
+          <w:p>
+            <w:pPr>
+              <w:spacing w:after="40"/>
+            </w:pPr>
+            <w:r>
+              <w:rPr>
+                <w:sz w:val="20"/>
+                <w:szCs w:val="20"/>
+              </w:rPr>
+              <w:t xml:space="preserve">number</w:t>
+            </w:r>
+          </w:p>
+        </w:tc>
+        <w:tc>
+          <w:tcPr>
             <w:tcW w:type="dxa" w:w="1100"/>
             <w:tcBorders>
               <w:top w:val="single" w:color="BFBFBF" w:sz="4"/>
@@ -2695,43 +2582,13 @@
                 <w:sz w:val="20"/>
                 <w:szCs w:val="20"/>
               </w:rPr>
-              <w:t xml:space="preserve">number</w:t>
-            </w:r>
-          </w:p>
-        </w:tc>
-        <w:tc>
-          <w:tcPr>
-            <w:tcW w:type="dxa" w:w="1100"/>
-            <w:tcBorders>
-              <w:top w:val="single" w:color="BFBFBF" w:sz="4"/>
-              <w:left w:val="single" w:color="BFBFBF" w:sz="4"/>
-              <w:bottom w:val="single" w:color="BFBFBF" w:sz="4"/>
-              <w:right w:val="single" w:color="BFBFBF" w:sz="4"/>
-            </w:tcBorders>
-            <w:shd w:fill="FFFFFF" w:val="clear"/>
-            <w:tcMar>
-              <w:top w:type="dxa" w:w="80"/>
-              <w:left w:type="dxa" w:w="140"/>
-              <w:bottom w:type="dxa" w:w="80"/>
-              <w:right w:type="dxa" w:w="140"/>
-            </w:tcMar>
-          </w:tcPr>
-          <w:p>
-            <w:pPr>
-              <w:spacing w:after="40"/>
-            </w:pPr>
-            <w:r>
-              <w:rPr>
-                <w:sz w:val="20"/>
-                <w:szCs w:val="20"/>
-              </w:rPr>
               <w:t xml:space="preserve">10080</w:t>
             </w:r>
           </w:p>
         </w:tc>
         <w:tc>
           <w:tcPr>
-            <w:tcW w:type="dxa" w:w="4760"/>
+            <w:tcW w:type="dxa" w:w="4460"/>
             <w:tcBorders>
               <w:top w:val="single" w:color="BFBFBF" w:sz="4"/>
               <w:left w:val="single" w:color="BFBFBF" w:sz="4"/>
@@ -2793,6 +2650,36 @@
         </w:tc>
         <w:tc>
           <w:tcPr>
+            <w:tcW w:type="dxa" w:w="1400"/>
+            <w:tcBorders>
+              <w:top w:val="single" w:color="BFBFBF" w:sz="4"/>
+              <w:left w:val="single" w:color="BFBFBF" w:sz="4"/>
+              <w:bottom w:val="single" w:color="BFBFBF" w:sz="4"/>
+              <w:right w:val="single" w:color="BFBFBF" w:sz="4"/>
+            </w:tcBorders>
+            <w:shd w:fill="F2F2F2" w:val="clear"/>
+            <w:tcMar>
+              <w:top w:type="dxa" w:w="80"/>
+              <w:left w:type="dxa" w:w="140"/>
+              <w:bottom w:type="dxa" w:w="80"/>
+              <w:right w:type="dxa" w:w="140"/>
+            </w:tcMar>
+          </w:tcPr>
+          <w:p>
+            <w:pPr>
+              <w:spacing w:after="40"/>
+            </w:pPr>
+            <w:r>
+              <w:rPr>
+                <w:sz w:val="20"/>
+                <w:szCs w:val="20"/>
+              </w:rPr>
+              <w:t xml:space="preserve">string</w:t>
+            </w:r>
+          </w:p>
+        </w:tc>
+        <w:tc>
+          <w:tcPr>
             <w:tcW w:type="dxa" w:w="1100"/>
             <w:tcBorders>
               <w:top w:val="single" w:color="BFBFBF" w:sz="4"/>
@@ -2817,43 +2704,13 @@
                 <w:sz w:val="20"/>
                 <w:szCs w:val="20"/>
               </w:rPr>
-              <w:t xml:space="preserve">string</w:t>
-            </w:r>
-          </w:p>
-        </w:tc>
-        <w:tc>
-          <w:tcPr>
-            <w:tcW w:type="dxa" w:w="1100"/>
-            <w:tcBorders>
-              <w:top w:val="single" w:color="BFBFBF" w:sz="4"/>
-              <w:left w:val="single" w:color="BFBFBF" w:sz="4"/>
-              <w:bottom w:val="single" w:color="BFBFBF" w:sz="4"/>
-              <w:right w:val="single" w:color="BFBFBF" w:sz="4"/>
-            </w:tcBorders>
-            <w:shd w:fill="F2F2F2" w:val="clear"/>
-            <w:tcMar>
-              <w:top w:type="dxa" w:w="80"/>
-              <w:left w:type="dxa" w:w="140"/>
-              <w:bottom w:type="dxa" w:w="80"/>
-              <w:right w:type="dxa" w:w="140"/>
-            </w:tcMar>
-          </w:tcPr>
-          <w:p>
-            <w:pPr>
-              <w:spacing w:after="40"/>
-            </w:pPr>
-            <w:r>
-              <w:rPr>
-                <w:sz w:val="20"/>
-                <w:szCs w:val="20"/>
-              </w:rPr>
               <w:t xml:space="preserve">(empty)</w:t>
             </w:r>
           </w:p>
         </w:tc>
         <w:tc>
           <w:tcPr>
-            <w:tcW w:type="dxa" w:w="4760"/>
+            <w:tcW w:type="dxa" w:w="4460"/>
             <w:tcBorders>
               <w:top w:val="single" w:color="BFBFBF" w:sz="4"/>
               <w:left w:val="single" w:color="BFBFBF" w:sz="4"/>
@@ -2909,7 +2766,37 @@
                 <w:sz w:val="20"/>
                 <w:szCs w:val="20"/>
               </w:rPr>
-              <w:t xml:space="preserve">descIgnoreString</w:t>
+              <w:t xml:space="preserve">descIgnoreStrings</w:t>
+            </w:r>
+          </w:p>
+        </w:tc>
+        <w:tc>
+          <w:tcPr>
+            <w:tcW w:type="dxa" w:w="1400"/>
+            <w:tcBorders>
+              <w:top w:val="single" w:color="BFBFBF" w:sz="4"/>
+              <w:left w:val="single" w:color="BFBFBF" w:sz="4"/>
+              <w:bottom w:val="single" w:color="BFBFBF" w:sz="4"/>
+              <w:right w:val="single" w:color="BFBFBF" w:sz="4"/>
+            </w:tcBorders>
+            <w:shd w:fill="FFFFFF" w:val="clear"/>
+            <w:tcMar>
+              <w:top w:type="dxa" w:w="80"/>
+              <w:left w:type="dxa" w:w="140"/>
+              <w:bottom w:type="dxa" w:w="80"/>
+              <w:right w:type="dxa" w:w="140"/>
+            </w:tcMar>
+          </w:tcPr>
+          <w:p>
+            <w:pPr>
+              <w:spacing w:after="40"/>
+            </w:pPr>
+            <w:r>
+              <w:rPr>
+                <w:sz w:val="20"/>
+                <w:szCs w:val="20"/>
+              </w:rPr>
+              <w:t xml:space="preserve">Array/string</w:t>
             </w:r>
           </w:p>
         </w:tc>
@@ -2939,13 +2826,13 @@
                 <w:sz w:val="20"/>
                 <w:szCs w:val="20"/>
               </w:rPr>
-              <w:t xml:space="preserve">string</w:t>
-            </w:r>
-          </w:p>
-        </w:tc>
-        <w:tc>
-          <w:tcPr>
-            <w:tcW w:type="dxa" w:w="1100"/>
+              <w:t xml:space="preserve">[]</w:t>
+            </w:r>
+          </w:p>
+        </w:tc>
+        <w:tc>
+          <w:tcPr>
+            <w:tcW w:type="dxa" w:w="4460"/>
             <w:tcBorders>
               <w:top w:val="single" w:color="BFBFBF" w:sz="4"/>
               <w:left w:val="single" w:color="BFBFBF" w:sz="4"/>
@@ -2969,37 +2856,7 @@
                 <w:sz w:val="20"/>
                 <w:szCs w:val="20"/>
               </w:rPr>
-              <w:t xml:space="preserve">(empty)</w:t>
-            </w:r>
-          </w:p>
-        </w:tc>
-        <w:tc>
-          <w:tcPr>
-            <w:tcW w:type="dxa" w:w="4760"/>
-            <w:tcBorders>
-              <w:top w:val="single" w:color="BFBFBF" w:sz="4"/>
-              <w:left w:val="single" w:color="BFBFBF" w:sz="4"/>
-              <w:bottom w:val="single" w:color="BFBFBF" w:sz="4"/>
-              <w:right w:val="single" w:color="BFBFBF" w:sz="4"/>
-            </w:tcBorders>
-            <w:shd w:fill="FFFFFF" w:val="clear"/>
-            <w:tcMar>
-              <w:top w:type="dxa" w:w="80"/>
-              <w:left w:type="dxa" w:w="140"/>
-              <w:bottom w:type="dxa" w:w="80"/>
-              <w:right w:type="dxa" w:w="140"/>
-            </w:tcMar>
-          </w:tcPr>
-          <w:p>
-            <w:pPr>
-              <w:spacing w:after="40"/>
-            </w:pPr>
-            <w:r>
-              <w:rPr>
-                <w:sz w:val="20"/>
-                <w:szCs w:val="20"/>
-              </w:rPr>
-              <w:t xml:space="preserve">Skip filter (case-insensitive substring). Backup tools should embed this string in their snapshot descriptions to opt out.</w:t>
+              <w:t xml:space="preserve">Array of ignore keywords. A snapshot is skipped if its description contains ANY of these strings (case-insensitive substring match). Empty array = no description filter. Replaces the former descIgnoreString (single string) parameter.</w:t>
             </w:r>
           </w:p>
         </w:tc>
@@ -3037,6 +2894,36 @@
         </w:tc>
         <w:tc>
           <w:tcPr>
+            <w:tcW w:type="dxa" w:w="1400"/>
+            <w:tcBorders>
+              <w:top w:val="single" w:color="BFBFBF" w:sz="4"/>
+              <w:left w:val="single" w:color="BFBFBF" w:sz="4"/>
+              <w:bottom w:val="single" w:color="BFBFBF" w:sz="4"/>
+              <w:right w:val="single" w:color="BFBFBF" w:sz="4"/>
+            </w:tcBorders>
+            <w:shd w:fill="F2F2F2" w:val="clear"/>
+            <w:tcMar>
+              <w:top w:type="dxa" w:w="80"/>
+              <w:left w:type="dxa" w:w="140"/>
+              <w:bottom w:type="dxa" w:w="80"/>
+              <w:right w:type="dxa" w:w="140"/>
+            </w:tcMar>
+          </w:tcPr>
+          <w:p>
+            <w:pPr>
+              <w:spacing w:after="40"/>
+            </w:pPr>
+            <w:r>
+              <w:rPr>
+                <w:sz w:val="20"/>
+                <w:szCs w:val="20"/>
+              </w:rPr>
+              <w:t xml:space="preserve">boolean</w:t>
+            </w:r>
+          </w:p>
+        </w:tc>
+        <w:tc>
+          <w:tcPr>
             <w:tcW w:type="dxa" w:w="1100"/>
             <w:tcBorders>
               <w:top w:val="single" w:color="BFBFBF" w:sz="4"/>
@@ -3061,43 +2948,13 @@
                 <w:sz w:val="20"/>
                 <w:szCs w:val="20"/>
               </w:rPr>
-              <w:t xml:space="preserve">boolean</w:t>
-            </w:r>
-          </w:p>
-        </w:tc>
-        <w:tc>
-          <w:tcPr>
-            <w:tcW w:type="dxa" w:w="1100"/>
-            <w:tcBorders>
-              <w:top w:val="single" w:color="BFBFBF" w:sz="4"/>
-              <w:left w:val="single" w:color="BFBFBF" w:sz="4"/>
-              <w:bottom w:val="single" w:color="BFBFBF" w:sz="4"/>
-              <w:right w:val="single" w:color="BFBFBF" w:sz="4"/>
-            </w:tcBorders>
-            <w:shd w:fill="F2F2F2" w:val="clear"/>
-            <w:tcMar>
-              <w:top w:type="dxa" w:w="80"/>
-              <w:left w:type="dxa" w:w="140"/>
-              <w:bottom w:type="dxa" w:w="80"/>
-              <w:right w:type="dxa" w:w="140"/>
-            </w:tcMar>
-          </w:tcPr>
-          <w:p>
-            <w:pPr>
-              <w:spacing w:after="40"/>
-            </w:pPr>
-            <w:r>
-              <w:rPr>
-                <w:sz w:val="20"/>
-                <w:szCs w:val="20"/>
-              </w:rPr>
               <w:t xml:space="preserve">true</w:t>
             </w:r>
           </w:p>
         </w:tc>
         <w:tc>
           <w:tcPr>
-            <w:tcW w:type="dxa" w:w="4760"/>
+            <w:tcW w:type="dxa" w:w="4460"/>
             <w:tcBorders>
               <w:top w:val="single" w:color="BFBFBF" w:sz="4"/>
               <w:left w:val="single" w:color="BFBFBF" w:sz="4"/>
@@ -3159,6 +3016,36 @@
         </w:tc>
         <w:tc>
           <w:tcPr>
+            <w:tcW w:type="dxa" w:w="1400"/>
+            <w:tcBorders>
+              <w:top w:val="single" w:color="BFBFBF" w:sz="4"/>
+              <w:left w:val="single" w:color="BFBFBF" w:sz="4"/>
+              <w:bottom w:val="single" w:color="BFBFBF" w:sz="4"/>
+              <w:right w:val="single" w:color="BFBFBF" w:sz="4"/>
+            </w:tcBorders>
+            <w:shd w:fill="FFFFFF" w:val="clear"/>
+            <w:tcMar>
+              <w:top w:type="dxa" w:w="80"/>
+              <w:left w:type="dxa" w:w="140"/>
+              <w:bottom w:type="dxa" w:w="80"/>
+              <w:right w:type="dxa" w:w="140"/>
+            </w:tcMar>
+          </w:tcPr>
+          <w:p>
+            <w:pPr>
+              <w:spacing w:after="40"/>
+            </w:pPr>
+            <w:r>
+              <w:rPr>
+                <w:sz w:val="20"/>
+                <w:szCs w:val="20"/>
+              </w:rPr>
+              <w:t xml:space="preserve">number</w:t>
+            </w:r>
+          </w:p>
+        </w:tc>
+        <w:tc>
+          <w:tcPr>
             <w:tcW w:type="dxa" w:w="1100"/>
             <w:tcBorders>
               <w:top w:val="single" w:color="BFBFBF" w:sz="4"/>
@@ -3183,43 +3070,13 @@
                 <w:sz w:val="20"/>
                 <w:szCs w:val="20"/>
               </w:rPr>
-              <w:t xml:space="preserve">number</w:t>
-            </w:r>
-          </w:p>
-        </w:tc>
-        <w:tc>
-          <w:tcPr>
-            <w:tcW w:type="dxa" w:w="1100"/>
-            <w:tcBorders>
-              <w:top w:val="single" w:color="BFBFBF" w:sz="4"/>
-              <w:left w:val="single" w:color="BFBFBF" w:sz="4"/>
-              <w:bottom w:val="single" w:color="BFBFBF" w:sz="4"/>
-              <w:right w:val="single" w:color="BFBFBF" w:sz="4"/>
-            </w:tcBorders>
-            <w:shd w:fill="FFFFFF" w:val="clear"/>
-            <w:tcMar>
-              <w:top w:type="dxa" w:w="80"/>
-              <w:left w:type="dxa" w:w="140"/>
-              <w:bottom w:type="dxa" w:w="80"/>
-              <w:right w:type="dxa" w:w="140"/>
-            </w:tcMar>
-          </w:tcPr>
-          <w:p>
-            <w:pPr>
-              <w:spacing w:after="40"/>
-            </w:pPr>
-            <w:r>
-              <w:rPr>
-                <w:sz w:val="20"/>
-                <w:szCs w:val="20"/>
-              </w:rPr>
               <w:t xml:space="preserve">30</w:t>
             </w:r>
           </w:p>
         </w:tc>
         <w:tc>
           <w:tcPr>
-            <w:tcW w:type="dxa" w:w="4760"/>
+            <w:tcW w:type="dxa" w:w="4460"/>
             <w:tcBorders>
               <w:top w:val="single" w:color="BFBFBF" w:sz="4"/>
               <w:left w:val="single" w:color="BFBFBF" w:sz="4"/>
@@ -3281,6 +3138,36 @@
         </w:tc>
         <w:tc>
           <w:tcPr>
+            <w:tcW w:type="dxa" w:w="1400"/>
+            <w:tcBorders>
+              <w:top w:val="single" w:color="BFBFBF" w:sz="4"/>
+              <w:left w:val="single" w:color="BFBFBF" w:sz="4"/>
+              <w:bottom w:val="single" w:color="BFBFBF" w:sz="4"/>
+              <w:right w:val="single" w:color="BFBFBF" w:sz="4"/>
+            </w:tcBorders>
+            <w:shd w:fill="F2F2F2" w:val="clear"/>
+            <w:tcMar>
+              <w:top w:type="dxa" w:w="80"/>
+              <w:left w:type="dxa" w:w="140"/>
+              <w:bottom w:type="dxa" w:w="80"/>
+              <w:right w:type="dxa" w:w="140"/>
+            </w:tcMar>
+          </w:tcPr>
+          <w:p>
+            <w:pPr>
+              <w:spacing w:after="40"/>
+            </w:pPr>
+            <w:r>
+              <w:rPr>
+                <w:sz w:val="20"/>
+                <w:szCs w:val="20"/>
+              </w:rPr>
+              <w:t xml:space="preserve">number</w:t>
+            </w:r>
+          </w:p>
+        </w:tc>
+        <w:tc>
+          <w:tcPr>
             <w:tcW w:type="dxa" w:w="1100"/>
             <w:tcBorders>
               <w:top w:val="single" w:color="BFBFBF" w:sz="4"/>
@@ -3305,43 +3192,13 @@
                 <w:sz w:val="20"/>
                 <w:szCs w:val="20"/>
               </w:rPr>
-              <w:t xml:space="preserve">number</w:t>
-            </w:r>
-          </w:p>
-        </w:tc>
-        <w:tc>
-          <w:tcPr>
-            <w:tcW w:type="dxa" w:w="1100"/>
-            <w:tcBorders>
-              <w:top w:val="single" w:color="BFBFBF" w:sz="4"/>
-              <w:left w:val="single" w:color="BFBFBF" w:sz="4"/>
-              <w:bottom w:val="single" w:color="BFBFBF" w:sz="4"/>
-              <w:right w:val="single" w:color="BFBFBF" w:sz="4"/>
-            </w:tcBorders>
-            <w:shd w:fill="F2F2F2" w:val="clear"/>
-            <w:tcMar>
-              <w:top w:type="dxa" w:w="80"/>
-              <w:left w:type="dxa" w:w="140"/>
-              <w:bottom w:type="dxa" w:w="80"/>
-              <w:right w:type="dxa" w:w="140"/>
-            </w:tcMar>
-          </w:tcPr>
-          <w:p>
-            <w:pPr>
-              <w:spacing w:after="40"/>
-            </w:pPr>
-            <w:r>
-              <w:rPr>
-                <w:sz w:val="20"/>
-                <w:szCs w:val="20"/>
-              </w:rPr>
               <w:t xml:space="preserve">50</w:t>
             </w:r>
           </w:p>
         </w:tc>
         <w:tc>
           <w:tcPr>
-            <w:tcW w:type="dxa" w:w="4760"/>
+            <w:tcW w:type="dxa" w:w="4460"/>
             <w:tcBorders>
               <w:top w:val="single" w:color="BFBFBF" w:sz="4"/>
               <w:left w:val="single" w:color="BFBFBF" w:sz="4"/>
@@ -3403,6 +3260,36 @@
         </w:tc>
         <w:tc>
           <w:tcPr>
+            <w:tcW w:type="dxa" w:w="1400"/>
+            <w:tcBorders>
+              <w:top w:val="single" w:color="BFBFBF" w:sz="4"/>
+              <w:left w:val="single" w:color="BFBFBF" w:sz="4"/>
+              <w:bottom w:val="single" w:color="BFBFBF" w:sz="4"/>
+              <w:right w:val="single" w:color="BFBFBF" w:sz="4"/>
+            </w:tcBorders>
+            <w:shd w:fill="FFFFFF" w:val="clear"/>
+            <w:tcMar>
+              <w:top w:type="dxa" w:w="80"/>
+              <w:left w:type="dxa" w:w="140"/>
+              <w:bottom w:type="dxa" w:w="80"/>
+              <w:right w:type="dxa" w:w="140"/>
+            </w:tcMar>
+          </w:tcPr>
+          <w:p>
+            <w:pPr>
+              <w:spacing w:after="40"/>
+            </w:pPr>
+            <w:r>
+              <w:rPr>
+                <w:sz w:val="20"/>
+                <w:szCs w:val="20"/>
+              </w:rPr>
+              <w:t xml:space="preserve">number</w:t>
+            </w:r>
+          </w:p>
+        </w:tc>
+        <w:tc>
+          <w:tcPr>
             <w:tcW w:type="dxa" w:w="1100"/>
             <w:tcBorders>
               <w:top w:val="single" w:color="BFBFBF" w:sz="4"/>
@@ -3427,43 +3314,13 @@
                 <w:sz w:val="20"/>
                 <w:szCs w:val="20"/>
               </w:rPr>
-              <w:t xml:space="preserve">number</w:t>
-            </w:r>
-          </w:p>
-        </w:tc>
-        <w:tc>
-          <w:tcPr>
-            <w:tcW w:type="dxa" w:w="1100"/>
-            <w:tcBorders>
-              <w:top w:val="single" w:color="BFBFBF" w:sz="4"/>
-              <w:left w:val="single" w:color="BFBFBF" w:sz="4"/>
-              <w:bottom w:val="single" w:color="BFBFBF" w:sz="4"/>
-              <w:right w:val="single" w:color="BFBFBF" w:sz="4"/>
-            </w:tcBorders>
-            <w:shd w:fill="FFFFFF" w:val="clear"/>
-            <w:tcMar>
-              <w:top w:type="dxa" w:w="80"/>
-              <w:left w:type="dxa" w:w="140"/>
-              <w:bottom w:type="dxa" w:w="80"/>
-              <w:right w:type="dxa" w:w="140"/>
-            </w:tcMar>
-          </w:tcPr>
-          <w:p>
-            <w:pPr>
-              <w:spacing w:after="40"/>
-            </w:pPr>
-            <w:r>
-              <w:rPr>
-                <w:sz w:val="20"/>
-                <w:szCs w:val="20"/>
-              </w:rPr>
               <w:t xml:space="preserve">10</w:t>
             </w:r>
           </w:p>
         </w:tc>
         <w:tc>
           <w:tcPr>
-            <w:tcW w:type="dxa" w:w="4760"/>
+            <w:tcW w:type="dxa" w:w="4460"/>
             <w:tcBorders>
               <w:top w:val="single" w:color="BFBFBF" w:sz="4"/>
               <w:left w:val="single" w:color="BFBFBF" w:sz="4"/>
@@ -3525,6 +3382,36 @@
         </w:tc>
         <w:tc>
           <w:tcPr>
+            <w:tcW w:type="dxa" w:w="1400"/>
+            <w:tcBorders>
+              <w:top w:val="single" w:color="BFBFBF" w:sz="4"/>
+              <w:left w:val="single" w:color="BFBFBF" w:sz="4"/>
+              <w:bottom w:val="single" w:color="BFBFBF" w:sz="4"/>
+              <w:right w:val="single" w:color="BFBFBF" w:sz="4"/>
+            </w:tcBorders>
+            <w:shd w:fill="F2F2F2" w:val="clear"/>
+            <w:tcMar>
+              <w:top w:type="dxa" w:w="80"/>
+              <w:left w:type="dxa" w:w="140"/>
+              <w:bottom w:type="dxa" w:w="80"/>
+              <w:right w:type="dxa" w:w="140"/>
+            </w:tcMar>
+          </w:tcPr>
+          <w:p>
+            <w:pPr>
+              <w:spacing w:after="40"/>
+            </w:pPr>
+            <w:r>
+              <w:rPr>
+                <w:sz w:val="20"/>
+                <w:szCs w:val="20"/>
+              </w:rPr>
+              <w:t xml:space="preserve">number</w:t>
+            </w:r>
+          </w:p>
+        </w:tc>
+        <w:tc>
+          <w:tcPr>
             <w:tcW w:type="dxa" w:w="1100"/>
             <w:tcBorders>
               <w:top w:val="single" w:color="BFBFBF" w:sz="4"/>
@@ -3549,43 +3436,13 @@
                 <w:sz w:val="20"/>
                 <w:szCs w:val="20"/>
               </w:rPr>
-              <w:t xml:space="preserve">number</w:t>
-            </w:r>
-          </w:p>
-        </w:tc>
-        <w:tc>
-          <w:tcPr>
-            <w:tcW w:type="dxa" w:w="1100"/>
-            <w:tcBorders>
-              <w:top w:val="single" w:color="BFBFBF" w:sz="4"/>
-              <w:left w:val="single" w:color="BFBFBF" w:sz="4"/>
-              <w:bottom w:val="single" w:color="BFBFBF" w:sz="4"/>
-              <w:right w:val="single" w:color="BFBFBF" w:sz="4"/>
-            </w:tcBorders>
-            <w:shd w:fill="F2F2F2" w:val="clear"/>
-            <w:tcMar>
-              <w:top w:type="dxa" w:w="80"/>
-              <w:left w:type="dxa" w:w="140"/>
-              <w:bottom w:type="dxa" w:w="80"/>
-              <w:right w:type="dxa" w:w="140"/>
-            </w:tcMar>
-          </w:tcPr>
-          <w:p>
-            <w:pPr>
-              <w:spacing w:after="40"/>
-            </w:pPr>
-            <w:r>
-              <w:rPr>
-                <w:sz w:val="20"/>
-                <w:szCs w:val="20"/>
-              </w:rPr>
               <w:t xml:space="preserve">3</w:t>
             </w:r>
           </w:p>
         </w:tc>
         <w:tc>
           <w:tcPr>
-            <w:tcW w:type="dxa" w:w="4760"/>
+            <w:tcW w:type="dxa" w:w="4460"/>
             <w:tcBorders>
               <w:top w:val="single" w:color="BFBFBF" w:sz="4"/>
               <w:left w:val="single" w:color="BFBFBF" w:sz="4"/>
@@ -3647,6 +3504,36 @@
         </w:tc>
         <w:tc>
           <w:tcPr>
+            <w:tcW w:type="dxa" w:w="1400"/>
+            <w:tcBorders>
+              <w:top w:val="single" w:color="BFBFBF" w:sz="4"/>
+              <w:left w:val="single" w:color="BFBFBF" w:sz="4"/>
+              <w:bottom w:val="single" w:color="BFBFBF" w:sz="4"/>
+              <w:right w:val="single" w:color="BFBFBF" w:sz="4"/>
+            </w:tcBorders>
+            <w:shd w:fill="FFFFFF" w:val="clear"/>
+            <w:tcMar>
+              <w:top w:type="dxa" w:w="80"/>
+              <w:left w:type="dxa" w:w="140"/>
+              <w:bottom w:type="dxa" w:w="80"/>
+              <w:right w:type="dxa" w:w="140"/>
+            </w:tcMar>
+          </w:tcPr>
+          <w:p>
+            <w:pPr>
+              <w:spacing w:after="40"/>
+            </w:pPr>
+            <w:r>
+              <w:rPr>
+                <w:sz w:val="20"/>
+                <w:szCs w:val="20"/>
+              </w:rPr>
+              <w:t xml:space="preserve">number</w:t>
+            </w:r>
+          </w:p>
+        </w:tc>
+        <w:tc>
+          <w:tcPr>
             <w:tcW w:type="dxa" w:w="1100"/>
             <w:tcBorders>
               <w:top w:val="single" w:color="BFBFBF" w:sz="4"/>
@@ -3671,43 +3558,13 @@
                 <w:sz w:val="20"/>
                 <w:szCs w:val="20"/>
               </w:rPr>
-              <w:t xml:space="preserve">number</w:t>
-            </w:r>
-          </w:p>
-        </w:tc>
-        <w:tc>
-          <w:tcPr>
-            <w:tcW w:type="dxa" w:w="1100"/>
-            <w:tcBorders>
-              <w:top w:val="single" w:color="BFBFBF" w:sz="4"/>
-              <w:left w:val="single" w:color="BFBFBF" w:sz="4"/>
-              <w:bottom w:val="single" w:color="BFBFBF" w:sz="4"/>
-              <w:right w:val="single" w:color="BFBFBF" w:sz="4"/>
-            </w:tcBorders>
-            <w:shd w:fill="FFFFFF" w:val="clear"/>
-            <w:tcMar>
-              <w:top w:type="dxa" w:w="80"/>
-              <w:left w:type="dxa" w:w="140"/>
-              <w:bottom w:type="dxa" w:w="80"/>
-              <w:right w:type="dxa" w:w="140"/>
-            </w:tcMar>
-          </w:tcPr>
-          <w:p>
-            <w:pPr>
-              <w:spacing w:after="40"/>
-            </w:pPr>
-            <w:r>
-              <w:rPr>
-                <w:sz w:val="20"/>
-                <w:szCs w:val="20"/>
-              </w:rPr>
               <w:t xml:space="preserve">30</w:t>
             </w:r>
           </w:p>
         </w:tc>
         <w:tc>
           <w:tcPr>
-            <w:tcW w:type="dxa" w:w="4760"/>
+            <w:tcW w:type="dxa" w:w="4460"/>
             <w:tcBorders>
               <w:top w:val="single" w:color="BFBFBF" w:sz="4"/>
               <w:left w:val="single" w:color="BFBFBF" w:sz="4"/>
@@ -3769,6 +3626,36 @@
         </w:tc>
         <w:tc>
           <w:tcPr>
+            <w:tcW w:type="dxa" w:w="1400"/>
+            <w:tcBorders>
+              <w:top w:val="single" w:color="BFBFBF" w:sz="4"/>
+              <w:left w:val="single" w:color="BFBFBF" w:sz="4"/>
+              <w:bottom w:val="single" w:color="BFBFBF" w:sz="4"/>
+              <w:right w:val="single" w:color="BFBFBF" w:sz="4"/>
+            </w:tcBorders>
+            <w:shd w:fill="F2F2F2" w:val="clear"/>
+            <w:tcMar>
+              <w:top w:type="dxa" w:w="80"/>
+              <w:left w:type="dxa" w:w="140"/>
+              <w:bottom w:type="dxa" w:w="80"/>
+              <w:right w:type="dxa" w:w="140"/>
+            </w:tcMar>
+          </w:tcPr>
+          <w:p>
+            <w:pPr>
+              <w:spacing w:after="40"/>
+            </w:pPr>
+            <w:r>
+              <w:rPr>
+                <w:sz w:val="20"/>
+                <w:szCs w:val="20"/>
+              </w:rPr>
+              <w:t xml:space="preserve">number</w:t>
+            </w:r>
+          </w:p>
+        </w:tc>
+        <w:tc>
+          <w:tcPr>
             <w:tcW w:type="dxa" w:w="1100"/>
             <w:tcBorders>
               <w:top w:val="single" w:color="BFBFBF" w:sz="4"/>
@@ -3793,43 +3680,13 @@
                 <w:sz w:val="20"/>
                 <w:szCs w:val="20"/>
               </w:rPr>
-              <w:t xml:space="preserve">number</w:t>
-            </w:r>
-          </w:p>
-        </w:tc>
-        <w:tc>
-          <w:tcPr>
-            <w:tcW w:type="dxa" w:w="1100"/>
-            <w:tcBorders>
-              <w:top w:val="single" w:color="BFBFBF" w:sz="4"/>
-              <w:left w:val="single" w:color="BFBFBF" w:sz="4"/>
-              <w:bottom w:val="single" w:color="BFBFBF" w:sz="4"/>
-              <w:right w:val="single" w:color="BFBFBF" w:sz="4"/>
-            </w:tcBorders>
-            <w:shd w:fill="F2F2F2" w:val="clear"/>
-            <w:tcMar>
-              <w:top w:type="dxa" w:w="80"/>
-              <w:left w:type="dxa" w:w="140"/>
-              <w:bottom w:type="dxa" w:w="80"/>
-              <w:right w:type="dxa" w:w="140"/>
-            </w:tcMar>
-          </w:tcPr>
-          <w:p>
-            <w:pPr>
-              <w:spacing w:after="40"/>
-            </w:pPr>
-            <w:r>
-              <w:rPr>
-                <w:sz w:val="20"/>
-                <w:szCs w:val="20"/>
-              </w:rPr>
               <w:t xml:space="preserve">1800</w:t>
             </w:r>
           </w:p>
         </w:tc>
         <w:tc>
           <w:tcPr>
-            <w:tcW w:type="dxa" w:w="4760"/>
+            <w:tcW w:type="dxa" w:w="4460"/>
             <w:tcBorders>
               <w:top w:val="single" w:color="BFBFBF" w:sz="4"/>
               <w:left w:val="single" w:color="BFBFBF" w:sz="4"/>
@@ -3861,40 +3718,231 @@
     </w:tbl>
     <w:p>
       <w:pPr>
+        <w:spacing w:after="60"/>
+      </w:pPr>
+      <w:r>
+        <w:t xml:space="preserve"> </w:t>
+      </w:r>
+    </w:p>
+    <w:p>
+      <w:pPr>
+        <w:pStyle w:val="Heading1"/>
+      </w:pPr>
+      <w:r>
+        <w:t xml:space="preserve">4. Multi-Value Description-Ignore Filter</w:t>
+      </w:r>
+    </w:p>
+    <w:p>
+      <w:pPr>
         <w:spacing w:after="120"/>
       </w:pPr>
       <w:r>
-        <w:t xml:space="preserve"> </w:t>
-      </w:r>
-    </w:p>
-    <w:p>
-      <w:pPr>
-        <w:pStyle w:val="Heading1"/>
-      </w:pPr>
-      <w:r>
-        <w:t xml:space="preserve">4. Concurrency and Locking</w:t>
-      </w:r>
-    </w:p>
-    <w:p>
-      <w:pPr>
-        <w:pStyle w:val="Heading2"/>
-      </w:pPr>
-      <w:r>
-        <w:t xml:space="preserve">4.1 Distributed mutex</w:t>
-      </w:r>
-    </w:p>
-    <w:p>
-      <w:pPr>
-        <w:spacing w:after="120"/>
-      </w:pPr>
-      <w:r>
-        <w:t xml:space="preserve">Two scheduled runs must never execute concurrently — they would both try to consolidate the same chains and corrupt the calibration state. The mutex is implemented as the </w:t>
+        <w:t xml:space="preserve">The </w:t>
       </w:r>
       <w:r>
         <w:rPr>
           <w:rFonts w:ascii="Consolas" w:cs="Consolas" w:eastAsia="Consolas" w:hAnsi="Consolas"/>
-          <w:sz w:val="22"/>
-          <w:szCs w:val="22"/>
+          <w:sz w:val="20"/>
+          <w:szCs w:val="20"/>
+        </w:rPr>
+        <w:t xml:space="preserve">descIgnoreStrings</w:t>
+      </w:r>
+      <w:r>
+        <w:t xml:space="preserve"> input parameter is a vRO </w:t>
+      </w:r>
+      <w:r>
+        <w:rPr>
+          <w:rFonts w:ascii="Consolas" w:cs="Consolas" w:eastAsia="Consolas" w:hAnsi="Consolas"/>
+          <w:sz w:val="20"/>
+          <w:szCs w:val="20"/>
+        </w:rPr>
+        <w:t xml:space="preserve">Array/string</w:t>
+      </w:r>
+      <w:r>
+        <w:t xml:space="preserve">. Each element represents an independent opt-out keyword. During the inventory scan (ST-03 / _getSnapshotCandidates), every snapshot’s description is evaluated against the full array. If the description contains any one of the array elements as a case-insensitive substring, the snapshot is excluded from the candidate list and is never considered for deletion.</w:t>
+      </w:r>
+    </w:p>
+    <w:p>
+      <w:pPr>
+        <w:pStyle w:val="Heading2"/>
+      </w:pPr>
+      <w:r>
+        <w:t xml:space="preserve">4.1 Matching semantics</w:t>
+      </w:r>
+    </w:p>
+    <w:p>
+      <w:pPr>
+        <w:pStyle w:val="ListParagraph"/>
+        <w:numPr>
+          <w:ilvl w:val="0"/>
+          <w:numId w:val="2"/>
+        </w:numPr>
+        <w:spacing w:after="80"/>
+      </w:pPr>
+      <w:r>
+        <w:t xml:space="preserve">The check is case-insensitive: an array element of "BACKUP" matches a description of "Veeam backup checkpoint 2026-04-21".</w:t>
+      </w:r>
+    </w:p>
+    <w:p>
+      <w:pPr>
+        <w:pStyle w:val="ListParagraph"/>
+        <w:numPr>
+          <w:ilvl w:val="0"/>
+          <w:numId w:val="2"/>
+        </w:numPr>
+        <w:spacing w:after="80"/>
+      </w:pPr>
+      <w:r>
+        <w:t xml:space="preserve">The check is substring-based: "KEEP" matches "KEEP-30-DAYS" as well as "do-not-delete-KEEP".</w:t>
+      </w:r>
+    </w:p>
+    <w:p>
+      <w:pPr>
+        <w:pStyle w:val="ListParagraph"/>
+        <w:numPr>
+          <w:ilvl w:val="0"/>
+          <w:numId w:val="2"/>
+        </w:numPr>
+        <w:spacing w:after="80"/>
+      </w:pPr>
+      <w:r>
+        <w:t xml:space="preserve">Each element is evaluated independently. A match on any single element is sufficient to skip the snapshot.</w:t>
+      </w:r>
+    </w:p>
+    <w:p>
+      <w:pPr>
+        <w:pStyle w:val="ListParagraph"/>
+        <w:numPr>
+          <w:ilvl w:val="0"/>
+          <w:numId w:val="2"/>
+        </w:numPr>
+        <w:spacing w:after="80"/>
+      </w:pPr>
+      <w:r>
+        <w:t xml:space="preserve">An empty array (the default) disables the filter entirely — no descriptions are checked.</w:t>
+      </w:r>
+    </w:p>
+    <w:p>
+      <w:pPr>
+        <w:pStyle w:val="ListParagraph"/>
+        <w:numPr>
+          <w:ilvl w:val="0"/>
+          <w:numId w:val="2"/>
+        </w:numPr>
+        <w:spacing w:after="80"/>
+      </w:pPr>
+      <w:r>
+        <w:t xml:space="preserve">Whitespace within each array element is significant. Leading and trailing whitespace is trimmed before comparison.</w:t>
+      </w:r>
+    </w:p>
+    <w:p>
+      <w:pPr>
+        <w:pStyle w:val="Heading2"/>
+      </w:pPr>
+      <w:r>
+        <w:t xml:space="preserve">4.2 Example array</w:t>
+      </w:r>
+    </w:p>
+    <w:p>
+      <w:pPr>
+        <w:shd w:fill="F2F2F2" w:val="clear"/>
+        <w:spacing w:after="0" w:before="0"/>
+        <w:ind w:left="360"/>
+      </w:pPr>
+      <w:r>
+        <w:rPr>
+          <w:rFonts w:ascii="Consolas" w:cs="Consolas" w:eastAsia="Consolas" w:hAnsi="Consolas"/>
+          <w:sz w:val="18"/>
+          <w:szCs w:val="18"/>
+        </w:rPr>
+        <w:t xml:space="preserve">["BACKUP-DO-NOT-DELETE", "DR-HOLD", "KEEP", "SRM-PROTECTED"]</w:t>
+      </w:r>
+    </w:p>
+    <w:p>
+      <w:pPr>
+        <w:spacing w:after="120"/>
+      </w:pPr>
+      <w:r>
+        <w:t xml:space="preserve">With this array, a snapshot whose description is "pre-upgrade DR-hold checkpoint" would be skipped (substring match on "DR-HOLD", case-insensitive). A snapshot with description "pre-upgrade restore point" would not be skipped and would be removed once it ages out.</w:t>
+      </w:r>
+    </w:p>
+    <w:p>
+      <w:pPr>
+        <w:pStyle w:val="Heading2"/>
+      </w:pPr>
+      <w:r>
+        <w:t xml:space="preserve">4.3 Migration from descIgnoreString</w:t>
+      </w:r>
+    </w:p>
+    <w:p>
+      <w:pPr>
+        <w:spacing w:after="120"/>
+      </w:pPr>
+      <w:r>
+        <w:t xml:space="preserve">The former </w:t>
+      </w:r>
+      <w:r>
+        <w:rPr>
+          <w:rFonts w:ascii="Consolas" w:cs="Consolas" w:eastAsia="Consolas" w:hAnsi="Consolas"/>
+          <w:sz w:val="20"/>
+          <w:szCs w:val="20"/>
+        </w:rPr>
+        <w:t xml:space="preserve">descIgnoreString</w:t>
+      </w:r>
+      <w:r>
+        <w:t xml:space="preserve"> (singular, type string) parameter has been replaced. Existing schedules that set a single ignore string must be updated to pass a one-element array instead. For example, if the old schedule set </w:t>
+      </w:r>
+      <w:r>
+        <w:rPr>
+          <w:rFonts w:ascii="Consolas" w:cs="Consolas" w:eastAsia="Consolas" w:hAnsi="Consolas"/>
+          <w:sz w:val="20"/>
+          <w:szCs w:val="20"/>
+        </w:rPr>
+        <w:t xml:space="preserve">descIgnoreString = "BACKUP-DO-NOT-DELETE"</w:t>
+      </w:r>
+      <w:r>
+        <w:t xml:space="preserve">, the new schedule should set </w:t>
+      </w:r>
+      <w:r>
+        <w:rPr>
+          <w:rFonts w:ascii="Consolas" w:cs="Consolas" w:eastAsia="Consolas" w:hAnsi="Consolas"/>
+          <w:sz w:val="20"/>
+          <w:szCs w:val="20"/>
+        </w:rPr>
+        <w:t xml:space="preserve">descIgnoreStrings = ["BACKUP-DO-NOT-DELETE"]</w:t>
+      </w:r>
+      <w:r>
+        <w:t xml:space="preserve">.</w:t>
+      </w:r>
+    </w:p>
+    <w:p>
+      <w:pPr>
+        <w:pStyle w:val="Heading1"/>
+      </w:pPr>
+      <w:r>
+        <w:t xml:space="preserve">5. Concurrency and Locking</w:t>
+      </w:r>
+    </w:p>
+    <w:p>
+      <w:pPr>
+        <w:pStyle w:val="Heading2"/>
+      </w:pPr>
+      <w:r>
+        <w:t xml:space="preserve">5.1 Distributed mutex</w:t>
+      </w:r>
+    </w:p>
+    <w:p>
+      <w:pPr>
+        <w:spacing w:after="120"/>
+      </w:pPr>
+      <w:r>
+        <w:t xml:space="preserve">Two scheduled runs must never execute concurrently — they would both try to consolidate the same chains and corrupt the calibration state. The mutex is implemented as the </w:t>
+      </w:r>
+      <w:r>
+        <w:rPr>
+          <w:rFonts w:ascii="Consolas" w:cs="Consolas" w:eastAsia="Consolas" w:hAnsi="Consolas"/>
+          <w:sz w:val="20"/>
+          <w:szCs w:val="20"/>
         </w:rPr>
         <w:t xml:space="preserve">runLock</w:t>
       </w:r>
@@ -3904,26 +3952,18 @@
     </w:p>
     <w:p>
       <w:pPr>
+        <w:pStyle w:val="Heading2"/>
+      </w:pPr>
+      <w:r>
+        <w:t xml:space="preserve">5.2 Per-vCenter dispatch</w:t>
+      </w:r>
+    </w:p>
+    <w:p>
+      <w:pPr>
         <w:spacing w:after="120"/>
       </w:pPr>
       <w:r>
-        <w:t xml:space="preserve">Configuration elements are global to the vRO instance and persist across workflow restarts, so the lock survives appliance reboots. The downside is that an abnormal exit that bypasses both ST-09 and the Exception Handler (for example, vRO process kill) will leave the lock set; recovery is documented in the User Documentation.</w:t>
-      </w:r>
-    </w:p>
-    <w:p>
-      <w:pPr>
-        <w:pStyle w:val="Heading2"/>
-      </w:pPr>
-      <w:r>
-        <w:t xml:space="preserve">4.2 Per-vCenter dispatch</w:t>
-      </w:r>
-    </w:p>
-    <w:p>
-      <w:pPr>
-        <w:spacing w:after="120"/>
-      </w:pPr>
-      <w:r>
-        <w:t xml:space="preserve">ST-06 implements adaptive dispatch within each vCenter. The behaviour is:</w:t>
+        <w:t xml:space="preserve">ST-06 implements adaptive dispatch within each vCenter:</w:t>
       </w:r>
     </w:p>
     <w:p>
@@ -3975,7 +4015,7 @@
         <w:spacing w:after="80"/>
       </w:pPr>
       <w:r>
-        <w:t xml:space="preserve">After each task completes, harvest its result and re-evaluate: if the next candidate’s projected impact (current latency + observed delta) stays within threshold, ramp currentConcurrency by 1, capped at maxParallel.</w:t>
+        <w:t xml:space="preserve">After each task completes, harvest its result and re-evaluate: if the next candidate’s projected impact stays within threshold, ramp currentConcurrency by 1, capped at maxParallel.</w:t>
       </w:r>
     </w:p>
     <w:p>
@@ -3988,7 +4028,7 @@
         <w:spacing w:after="80"/>
       </w:pPr>
       <w:r>
-        <w:t xml:space="preserve">If projected impact would breach threshold, hold currentConcurrency at its current level and wait for an active task to complete.</w:t>
+        <w:t xml:space="preserve">If projected impact would breach threshold, hold currentConcurrency at its current level.</w:t>
       </w:r>
     </w:p>
     <w:p>
@@ -4001,7 +4041,7 @@
         <w:spacing w:after="80"/>
       </w:pPr>
       <w:r>
-        <w:t xml:space="preserve">Hard constraint: never dispatch a second task for a VM that is already in flight (per-VM serialisation, regardless of concurrency level).</w:t>
+        <w:t xml:space="preserve">Hard constraint: never dispatch a second task for a VM that is already in flight.</w:t>
       </w:r>
     </w:p>
     <w:p>
@@ -4009,7 +4049,7 @@
         <w:pStyle w:val="Heading2"/>
       </w:pPr>
       <w:r>
-        <w:t xml:space="preserve">4.3 Hold and defer</w:t>
+        <w:t xml:space="preserve">5.3 Hold and defer</w:t>
       </w:r>
     </w:p>
     <w:p>
@@ -4017,18 +4057,18 @@
         <w:spacing w:after="120"/>
       </w:pPr>
       <w:r>
-        <w:t xml:space="preserve">If the governor denies dispatch and there are no other tasks running, ST-06 polls every governorPollIntervalSec (default 30s) up to a hard cap of 120 attempts (one hour by default). After the cap is exhausted the candidate is logged as </w:t>
+        <w:t xml:space="preserve">If the governor denies dispatch and there are no other tasks running, ST-06 polls every governorPollIntervalSec (default 30s) up to 120 attempts (one hour). After the cap, the candidate is logged as </w:t>
       </w:r>
       <w:r>
         <w:rPr>
           <w:rFonts w:ascii="Consolas" w:cs="Consolas" w:eastAsia="Consolas" w:hAnsi="Consolas"/>
-          <w:sz w:val="22"/>
-          <w:szCs w:val="22"/>
+          <w:sz w:val="20"/>
+          <w:szCs w:val="20"/>
         </w:rPr>
         <w:t xml:space="preserve">deferred</w:t>
       </w:r>
       <w:r>
-        <w:t xml:space="preserve"> and the next candidate is attempted. Deferred snapshots are picked up automatically on the next scheduled run.</w:t>
+        <w:t xml:space="preserve"> and the next candidate is attempted. Deferred snapshots are picked up on the next scheduled run.</w:t>
       </w:r>
     </w:p>
     <w:p>
@@ -4036,7 +4076,7 @@
         <w:pStyle w:val="Heading1"/>
       </w:pPr>
       <w:r>
-        <w:t xml:space="preserve">5. Adaptive I/O Governor</w:t>
+        <w:t xml:space="preserve">6. Adaptive I/O Governor</w:t>
       </w:r>
     </w:p>
     <w:p>
@@ -4044,7 +4084,7 @@
         <w:spacing w:after="120"/>
       </w:pPr>
       <w:r>
-        <w:t xml:space="preserve">The governor is the heart of the design. It exists because consolidation cost is unknown until it has actually happened on this datastore: a 10 MB snapshot can take milliseconds; a 500 GB snapshot on a busy NFS array can take minutes and saturate the wire. Static thresholds always either underuse the available headroom or breach it.</w:t>
+        <w:t xml:space="preserve">The governor exists because consolidation cost is unknown until it has actually happened on this datastore: a 10 MB snapshot can take milliseconds; a 500 GB snapshot on a busy NFS array can take minutes.</w:t>
       </w:r>
     </w:p>
     <w:p>
@@ -4052,7 +4092,7 @@
         <w:pStyle w:val="Heading2"/>
       </w:pPr>
       <w:r>
-        <w:t xml:space="preserve">5.1 Decision rule</w:t>
+        <w:t xml:space="preserve">6.1 Decision rule</w:t>
       </w:r>
     </w:p>
     <w:p>
@@ -4065,9 +4105,9 @@
     </w:p>
     <w:p>
       <w:pPr>
-        <w:pStyle w:val="Code"/>
         <w:shd w:fill="F2F2F2" w:val="clear"/>
         <w:spacing w:after="0" w:before="0"/>
+        <w:ind w:left="360"/>
       </w:pPr>
       <w:r>
         <w:rPr>
@@ -4080,9 +4120,9 @@
     </w:p>
     <w:p>
       <w:pPr>
-        <w:pStyle w:val="Code"/>
         <w:shd w:fill="F2F2F2" w:val="clear"/>
         <w:spacing w:after="0" w:before="0"/>
+        <w:ind w:left="360"/>
       </w:pPr>
       <w:r>
         <w:rPr>
@@ -4098,7 +4138,7 @@
         <w:spacing w:after="120"/>
       </w:pPr>
       <w:r>
-        <w:t xml:space="preserve">For vSAN, the same rule is applied to congestion and (when available) resync queue depth, against vsanCongestionThresh and vsanResyncThresholdGB respectively.</w:t>
+        <w:t xml:space="preserve">For vSAN, the same rule is applied to congestion and resync queue depth.</w:t>
       </w:r>
     </w:p>
     <w:p>
@@ -4106,7 +4146,7 @@
         <w:pStyle w:val="Heading2"/>
       </w:pPr>
       <w:r>
-        <w:t xml:space="preserve">5.2 Calibration</w:t>
+        <w:t xml:space="preserve">6.2 Calibration and lane inheritance</w:t>
       </w:r>
     </w:p>
     <w:p>
@@ -4114,7 +4154,7 @@
         <w:spacing w:after="120"/>
       </w:pPr>
       <w:r>
-        <w:t xml:space="preserve">The first task on any datastore has no calibration data. The governor approves automatically in this case (logged as “First task on these datastores”) because denying every first task would create a chicken-and-egg deadlock. After the first task completes, _deleteSnapshot writes pre/post metric snapshots into datastoreStateJson, and the governor uses the observed delta on every subsequent task targeting that datastore.</w:t>
+        <w:t xml:space="preserve">The first task on any datastore is always approved (no calibration data). After it completes, _deleteSnapshot writes pre/post metric snapshots into datastoreStateJson. ST-07 (powered-off lane) inherits this state from ST-06 so shared datastores do not start blind.</w:t>
       </w:r>
     </w:p>
     <w:p>
@@ -4122,7 +4162,7 @@
         <w:pStyle w:val="Heading2"/>
       </w:pPr>
       <w:r>
-        <w:t xml:space="preserve">5.3 Lane inheritance</w:t>
+        <w:t xml:space="preserve">6.3 Metric collection</w:t>
       </w:r>
     </w:p>
     <w:p>
@@ -4130,289 +4170,15 @@
         <w:spacing w:after="120"/>
       </w:pPr>
       <w:r>
-        <w:t xml:space="preserve">ST-07 (powered-off lane) inherits datastoreStateJson from ST-06. This matters because shared datastores are common: a powered-off VM may live on the same vSAN cluster as a powered-on VM whose consolidation just completed. Inheriting the calibration means ST-07 does not start blind on those datastores.</w:t>
-      </w:r>
-    </w:p>
-    <w:p>
-      <w:pPr>
-        <w:pStyle w:val="Heading2"/>
-      </w:pPr>
-      <w:r>
-        <w:t xml:space="preserve">5.4 Metric collection</w:t>
-      </w:r>
-    </w:p>
-    <w:p>
-      <w:pPr>
-        <w:spacing w:after="120"/>
-      </w:pPr>
-      <w:r>
-        <w:t xml:space="preserve">VMFS and NFS metrics are read via PerformanceManager.queryPerf with intervalId=20 (real-time, 20-second buckets), falling back to intervalId=300 (5-minute aggregated) if real-time is unavailable. The counters used are:</w:t>
-      </w:r>
-    </w:p>
-    <w:p>
-      <w:pPr>
-        <w:pStyle w:val="ListParagraph"/>
-        <w:numPr>
-          <w:ilvl w:val="0"/>
-          <w:numId w:val="2"/>
-        </w:numPr>
-        <w:spacing w:after="80"/>
-      </w:pPr>
-      <w:r>
-        <w:t xml:space="preserve">datastore:totalReadLatency:average (→ readLatencyMs)</w:t>
-      </w:r>
-    </w:p>
-    <w:p>
-      <w:pPr>
-        <w:pStyle w:val="ListParagraph"/>
-        <w:numPr>
-          <w:ilvl w:val="0"/>
-          <w:numId w:val="2"/>
-        </w:numPr>
-        <w:spacing w:after="80"/>
-      </w:pPr>
-      <w:r>
-        <w:t xml:space="preserve">datastore:totalWriteLatency:average (→ writeLatencyMs)</w:t>
-      </w:r>
-    </w:p>
-    <w:p>
-      <w:pPr>
-        <w:pStyle w:val="ListParagraph"/>
-        <w:numPr>
-          <w:ilvl w:val="0"/>
-          <w:numId w:val="2"/>
-        </w:numPr>
-        <w:spacing w:after="80"/>
-      </w:pPr>
-      <w:r>
-        <w:t xml:space="preserve">datastore:numberReadAveraged:average (→ iopsRead)</w:t>
-      </w:r>
-    </w:p>
-    <w:p>
-      <w:pPr>
-        <w:pStyle w:val="ListParagraph"/>
-        <w:numPr>
-          <w:ilvl w:val="0"/>
-          <w:numId w:val="2"/>
-        </w:numPr>
-        <w:spacing w:after="80"/>
-      </w:pPr>
-      <w:r>
-        <w:t xml:space="preserve">datastore:numberWriteAveraged:average (→ iopsWrite)</w:t>
-      </w:r>
-    </w:p>
-    <w:p>
-      <w:pPr>
-        <w:spacing w:after="120"/>
-      </w:pPr>
-      <w:r>
-        <w:t xml:space="preserve">vSAN counters cannot be queried via queryPerf in vCenter 9. The action instead calls </w:t>
-      </w:r>
-      <w:r>
-        <w:rPr>
-          <w:rFonts w:ascii="Consolas" w:cs="Consolas" w:eastAsia="Consolas" w:hAnsi="Consolas"/>
-          <w:sz w:val="22"/>
-          <w:szCs w:val="22"/>
-        </w:rPr>
-        <w:t xml:space="preserve">HostVsanInternalSystem.queryVsanStatistics(["dom"])</w:t>
-      </w:r>
-      <w:r>
-        <w:t xml:space="preserve"> on every host in the vSAN cluster, parses dom.owner.stats, takes two snapshots two seconds apart, and computes deltas to derive a point-in-time rate. Latency is high-depth duration divided by high-depth count; congestion is the sum of readCachedCongestionSum and proxyWriteCongestionSum delta, normalised by host count.</w:t>
-      </w:r>
-    </w:p>
-    <w:tbl>
-      <w:tblPr>
-        <w:tblW w:type="dxa" w:w="9360"/>
-        <w:tblBorders>
-          <w:top w:val="single" w:color="auto" w:sz="4"/>
-          <w:left w:val="single" w:color="auto" w:sz="4"/>
-          <w:bottom w:val="single" w:color="auto" w:sz="4"/>
-          <w:right w:val="single" w:color="auto" w:sz="4"/>
-          <w:insideH w:val="single" w:color="auto" w:sz="4"/>
-          <w:insideV w:val="single" w:color="auto" w:sz="4"/>
-        </w:tblBorders>
-      </w:tblPr>
-      <w:tblGrid>
-        <w:gridCol w:w="120"/>
-        <w:gridCol w:w="9240"/>
-      </w:tblGrid>
-      <w:tr>
-        <w:tc>
-          <w:tcPr>
-            <w:tcW w:type="dxa" w:w="120"/>
-            <w:tcBorders>
-              <w:top w:val="none"/>
-              <w:left w:val="none"/>
-              <w:bottom w:val="none"/>
-              <w:right w:val="none"/>
-            </w:tcBorders>
-            <w:shd w:fill="2E75B6" w:val="clear"/>
-            <w:tcMar>
-              <w:top w:type="dxa" w:w="0"/>
-              <w:left w:type="dxa" w:w="0"/>
-              <w:bottom w:type="dxa" w:w="0"/>
-              <w:right w:type="dxa" w:w="0"/>
-            </w:tcMar>
-          </w:tcPr>
-          <w:p>
-            <w:pPr>
-              <w:spacing w:after="0"/>
-            </w:pPr>
-            <w:r>
-              <w:t xml:space="preserve"> </w:t>
-            </w:r>
-          </w:p>
-        </w:tc>
-        <w:tc>
-          <w:tcPr>
-            <w:tcW w:type="dxa" w:w="9240"/>
-            <w:tcBorders>
-              <w:top w:val="none"/>
-              <w:left w:val="none"/>
-              <w:bottom w:val="none"/>
-              <w:right w:val="none"/>
-            </w:tcBorders>
-            <w:shd w:fill="D5E8F0" w:val="clear"/>
-            <w:tcMar>
-              <w:top w:type="dxa" w:w="140"/>
-              <w:left w:type="dxa" w:w="200"/>
-              <w:bottom w:type="dxa" w:w="140"/>
-              <w:right w:type="dxa" w:w="200"/>
-            </w:tcMar>
-          </w:tcPr>
-          <w:p>
-            <w:pPr>
-              <w:spacing w:after="60"/>
-            </w:pPr>
-            <w:r>
-              <w:rPr>
-                <w:b/>
-                <w:bCs/>
-                <w:color w:val="1F1F1F"/>
-                <w:sz w:val="22"/>
-                <w:szCs w:val="22"/>
-              </w:rPr>
-              <w:t xml:space="preserve">Why "first sample is null"</w:t>
-            </w:r>
-          </w:p>
-          <w:p>
-            <w:pPr>
-              <w:spacing w:after="0"/>
-            </w:pPr>
-            <w:r>
-              <w:rPr>
-                <w:sz w:val="22"/>
-                <w:szCs w:val="22"/>
-              </w:rPr>
-              <w:t xml:space="preserve">When there is no recent vSAN load, the high-depth counters do not increment between snapshots, so latency is reported as null (uncalibrated) rather than zero. The governor explicitly skips null fields rather than treating them as healthy. This is intentional: “no data” is not the same as “no load.”</w:t>
-            </w:r>
-          </w:p>
-        </w:tc>
-      </w:tr>
-    </w:tbl>
+        <w:t xml:space="preserve">VMFS/NFS: PerformanceManager.queryPerf with intervalId=20 (real-time), fallback to 300. vSAN: HostVsanInternalSystem.queryVsanStatistics(["dom"]) on every cluster host, two snapshots two seconds apart, delta-based rate derivation.</w:t>
+      </w:r>
+    </w:p>
     <w:p>
       <w:pPr>
         <w:pStyle w:val="Heading1"/>
       </w:pPr>
       <w:r>
-        <w:t xml:space="preserve">6. Snapshot Chain Ordering</w:t>
-      </w:r>
-    </w:p>
-    <w:p>
-      <w:pPr>
-        <w:spacing w:after="120"/>
-      </w:pPr>
-      <w:r>
-        <w:t xml:space="preserve">vCenter rejects deletion of a snapshot if it has live children, so the workflow must always remove leaves first. ST-05 implements this as a topological sort over each VM’s candidate set:</w:t>
-      </w:r>
-    </w:p>
-    <w:p>
-      <w:pPr>
-        <w:pStyle w:val="ListParagraph"/>
-        <w:numPr>
-          <w:ilvl w:val="0"/>
-          <w:numId w:val="3"/>
-        </w:numPr>
-        <w:spacing w:after="80"/>
-      </w:pPr>
-      <w:r>
-        <w:t xml:space="preserve">Group candidates by vmMoRef.</w:t>
-      </w:r>
-    </w:p>
-    <w:p>
-      <w:pPr>
-        <w:pStyle w:val="ListParagraph"/>
-        <w:numPr>
-          <w:ilvl w:val="0"/>
-          <w:numId w:val="3"/>
-        </w:numPr>
-        <w:spacing w:after="80"/>
-      </w:pPr>
-      <w:r>
-        <w:t xml:space="preserve">For each group, build a set of “is a parent of another candidate” references. Crucially, only consider parent links pointing to other candidates in this group — filtered-out snapshots are invisible to the sort, which prevents the sort from getting stuck when a filtered snapshot sits in the middle of a chain.</w:t>
-      </w:r>
-    </w:p>
-    <w:p>
-      <w:pPr>
-        <w:pStyle w:val="ListParagraph"/>
-        <w:numPr>
-          <w:ilvl w:val="0"/>
-          <w:numId w:val="3"/>
-        </w:numPr>
-        <w:spacing w:after="80"/>
-      </w:pPr>
-      <w:r>
-        <w:t xml:space="preserve">Apply Kahn’s algorithm: emit leaves (no remaining children), then unmark their parents. Repeat until the set is empty.</w:t>
-      </w:r>
-    </w:p>
-    <w:p>
-      <w:pPr>
-        <w:pStyle w:val="ListParagraph"/>
-        <w:numPr>
-          <w:ilvl w:val="0"/>
-          <w:numId w:val="3"/>
-        </w:numPr>
-        <w:spacing w:after="80"/>
-      </w:pPr>
-      <w:r>
-        <w:t xml:space="preserve">Within each “leaves” batch, sort by ageMinutes ascending (newest first) so the deepest snapshot in the chain is the first one removed.</w:t>
-      </w:r>
-    </w:p>
-    <w:p>
-      <w:pPr>
-        <w:pStyle w:val="ListParagraph"/>
-        <w:numPr>
-          <w:ilvl w:val="0"/>
-          <w:numId w:val="3"/>
-        </w:numPr>
-        <w:spacing w:after="80"/>
-      </w:pPr>
-      <w:r>
-        <w:t xml:space="preserve">If a cycle is detected (which should be impossible for a real snapshot chain), emit the remainder unsorted with a warning rather than hanging.</w:t>
-      </w:r>
-    </w:p>
-    <w:p>
-      <w:pPr>
-        <w:spacing w:after="120"/>
-      </w:pPr>
-      <w:r>
-        <w:t xml:space="preserve">After ordering, the result is split by power state into two lanes (onCandidatesJson and offCandidatesJson) for the dispatcher.</w:t>
-      </w:r>
-    </w:p>
-    <w:p>
-      <w:pPr>
-        <w:pStyle w:val="Heading1"/>
-      </w:pPr>
-      <w:r>
         <w:t xml:space="preserve">7. Per-Snapshot Safety Checks</w:t>
-      </w:r>
-    </w:p>
-    <w:p>
-      <w:pPr>
-        <w:spacing w:after="120"/>
-      </w:pPr>
-      <w:r>
-        <w:t xml:space="preserve">_deleteSnapshot performs a sequence of safety checks before submitting the removeSnapshot_Task call. Any check that fails causes the candidate to be skipped (not failed) and logged with a skipReason:</w:t>
       </w:r>
     </w:p>
     <w:tbl>
@@ -4444,7 +4210,7 @@
               <w:bottom w:val="single" w:color="BFBFBF" w:sz="4"/>
               <w:right w:val="single" w:color="BFBFBF" w:sz="4"/>
             </w:tcBorders>
-            <w:shd w:fill="1F3864" w:val="clear"/>
+            <w:shd w:fill="0A1F3D" w:val="clear"/>
             <w:tcMar>
               <w:top w:type="dxa" w:w="100"/>
               <w:left w:type="dxa" w:w="140"/>
@@ -4458,11 +4224,12 @@
             </w:pPr>
             <w:r>
               <w:rPr>
+                <w:rFonts w:ascii="Arial" w:cs="Arial" w:eastAsia="Arial" w:hAnsi="Arial"/>
                 <w:b/>
                 <w:bCs/>
                 <w:color w:val="FFFFFF"/>
-                <w:sz w:val="22"/>
-                <w:szCs w:val="22"/>
+                <w:sz w:val="20"/>
+                <w:szCs w:val="20"/>
               </w:rPr>
               <w:t xml:space="preserve">Check</w:t>
             </w:r>
@@ -4477,7 +4244,7 @@
               <w:bottom w:val="single" w:color="BFBFBF" w:sz="4"/>
               <w:right w:val="single" w:color="BFBFBF" w:sz="4"/>
             </w:tcBorders>
-            <w:shd w:fill="1F3864" w:val="clear"/>
+            <w:shd w:fill="0A1F3D" w:val="clear"/>
             <w:tcMar>
               <w:top w:type="dxa" w:w="100"/>
               <w:left w:type="dxa" w:w="140"/>
@@ -4491,11 +4258,12 @@
             </w:pPr>
             <w:r>
               <w:rPr>
+                <w:rFonts w:ascii="Arial" w:cs="Arial" w:eastAsia="Arial" w:hAnsi="Arial"/>
                 <w:b/>
                 <w:bCs/>
                 <w:color w:val="FFFFFF"/>
-                <w:sz w:val="22"/>
-                <w:szCs w:val="22"/>
+                <w:sz w:val="20"/>
+                <w:szCs w:val="20"/>
               </w:rPr>
               <w:t xml:space="preserve">Skip reason</w:t>
             </w:r>
@@ -4559,7 +4327,7 @@
                 <w:sz w:val="20"/>
                 <w:szCs w:val="20"/>
               </w:rPr>
-              <w:t xml:space="preserve">Resolves the vmMoRef (which is vm.id from vRO inventory) by traversing the same tree used during enumeration. If not found, the VM was deleted or moved since the scan.</w:t>
+              <w:t xml:space="preserve">Resolves vmMoRef by traversing the same inventory tree used during enumeration. If not found, the VM was deleted or moved since the scan.</w:t>
             </w:r>
           </w:p>
         </w:tc>
@@ -4621,7 +4389,7 @@
                 <w:sz w:val="20"/>
                 <w:szCs w:val="20"/>
               </w:rPr>
-              <w:t xml:space="preserve">Templates are never modified. Belt-and-braces; the enumerator already filters templates.</w:t>
+              <w:t xml:space="preserve">Templates are never modified.</w:t>
             </w:r>
           </w:p>
         </w:tc>
@@ -4745,7 +4513,7 @@
                 <w:sz w:val="20"/>
                 <w:szCs w:val="20"/>
               </w:rPr>
-              <w:t xml:space="preserve">If vm.runtime.host.runtime.connectionState is disconnected or notResponding, the action skips to avoid data loss during a possible HA event.</w:t>
+              <w:t xml:space="preserve">Skips if host connectionState is disconnected or notResponding to avoid data loss during a possible HA event.</w:t>
             </w:r>
           </w:p>
         </w:tc>
@@ -4807,7 +4575,7 @@
                 <w:sz w:val="20"/>
                 <w:szCs w:val="20"/>
               </w:rPr>
-              <w:t xml:space="preserve">Primary lookup by MoRef. If the MoRef is stale (vCenter sometimes reorganises chains during consolidation), falls back to matching on snapshot name and createTime within a 60-second tolerance.</w:t>
+              <w:t xml:space="preserve">Primary lookup by MoRef. Fallback: match on snapshot name and createTime within a 60-second tolerance if MoRef is stale after chain reorganisation.</w:t>
             </w:r>
           </w:p>
         </w:tc>
@@ -4815,7 +4583,7 @@
     </w:tbl>
     <w:p>
       <w:pPr>
-        <w:spacing w:after="120"/>
+        <w:spacing w:after="60"/>
       </w:pPr>
       <w:r>
         <w:t xml:space="preserve"> </w:t>
@@ -4839,17 +4607,9 @@
     </w:p>
     <w:p>
       <w:pPr>
-        <w:spacing w:after="120"/>
-      </w:pPr>
-      <w:r>
-        <w:t xml:space="preserve">Every log line emitted by the workflow uses the format:</w:t>
-      </w:r>
-    </w:p>
-    <w:p>
-      <w:pPr>
-        <w:pStyle w:val="Code"/>
         <w:shd w:fill="F2F2F2" w:val="clear"/>
         <w:spacing w:after="0" w:before="0"/>
+        <w:ind w:left="360"/>
       </w:pPr>
       <w:r>
         <w:rPr>
@@ -4865,18 +4625,7 @@
         <w:spacing w:after="120"/>
       </w:pPr>
       <w:r>
-        <w:t xml:space="preserve">Phase markers are STARTUP, INVENTORY, PROCESSING, FINALISE, ERROR. Status markers are OK, SKIP, DONE, DRY-RUN, HOLD, WARN, FAIL, RESULT. A single text search in Aria Operations for Logs for </w:t>
-      </w:r>
-      <w:r>
-        <w:rPr>
-          <w:rFonts w:ascii="Consolas" w:cs="Consolas" w:eastAsia="Consolas" w:hAnsi="Consolas"/>
-          <w:sz w:val="22"/>
-          <w:szCs w:val="22"/>
-        </w:rPr>
-        <w:t xml:space="preserve">[SNAPSHOT-CLEANUP]</w:t>
-      </w:r>
-      <w:r>
-        <w:t xml:space="preserve"> returns every line from every run.</w:t>
+        <w:t xml:space="preserve">Phase markers: STARTUP, INVENTORY, PROCESSING, FINALISE, ERROR. Status markers: OK, SKIP, DONE, DRY-RUN, HOLD, WARN, FAIL, RESULT.</w:t>
       </w:r>
     </w:p>
     <w:p>
@@ -4884,38 +4633,14 @@
         <w:pStyle w:val="Heading2"/>
       </w:pPr>
       <w:r>
-        <w:t xml:space="preserve">8.2 Run ID correlation</w:t>
-      </w:r>
-    </w:p>
-    <w:p>
-      <w:pPr>
-        <w:spacing w:after="120"/>
-      </w:pPr>
-      <w:r>
-        <w:t xml:space="preserve">Every log entry written to the runLog accumulator carries the runId. The final result block (RESULT marker) prints the runId in its header, so any line in the log can be traced back to the originating run.</w:t>
-      </w:r>
-    </w:p>
-    <w:p>
-      <w:pPr>
-        <w:pStyle w:val="Heading2"/>
-      </w:pPr>
-      <w:r>
-        <w:t xml:space="preserve">8.3 Structured output</w:t>
-      </w:r>
-    </w:p>
-    <w:p>
-      <w:pPr>
-        <w:spacing w:after="120"/>
-      </w:pPr>
-      <w:r>
-        <w:t xml:space="preserve">ST-09 writes runSummaryJson to a workflow output attribute. This is a machine-readable summary suitable for downstream automation:</w:t>
-      </w:r>
-    </w:p>
-    <w:p>
-      <w:pPr>
-        <w:pStyle w:val="Code"/>
+        <w:t xml:space="preserve">8.2 Structured output (runSummaryJson)</w:t>
+      </w:r>
+    </w:p>
+    <w:p>
+      <w:pPr>
         <w:shd w:fill="F2F2F2" w:val="clear"/>
         <w:spacing w:after="0" w:before="0"/>
+        <w:ind w:left="360"/>
       </w:pPr>
       <w:r>
         <w:rPr>
@@ -4928,9 +4653,9 @@
     </w:p>
     <w:p>
       <w:pPr>
-        <w:pStyle w:val="Code"/>
         <w:shd w:fill="F2F2F2" w:val="clear"/>
         <w:spacing w:after="0" w:before="0"/>
+        <w:ind w:left="360"/>
       </w:pPr>
       <w:r>
         <w:rPr>
@@ -4943,9 +4668,9 @@
     </w:p>
     <w:p>
       <w:pPr>
-        <w:pStyle w:val="Code"/>
         <w:shd w:fill="F2F2F2" w:val="clear"/>
         <w:spacing w:after="0" w:before="0"/>
+        <w:ind w:left="360"/>
       </w:pPr>
       <w:r>
         <w:rPr>
@@ -4958,9 +4683,9 @@
     </w:p>
     <w:p>
       <w:pPr>
-        <w:pStyle w:val="Code"/>
         <w:shd w:fill="F2F2F2" w:val="clear"/>
         <w:spacing w:after="0" w:before="0"/>
+        <w:ind w:left="360"/>
       </w:pPr>
       <w:r>
         <w:rPr>
@@ -4973,9 +4698,9 @@
     </w:p>
     <w:p>
       <w:pPr>
-        <w:pStyle w:val="Code"/>
         <w:shd w:fill="F2F2F2" w:val="clear"/>
         <w:spacing w:after="0" w:before="0"/>
+        <w:ind w:left="360"/>
       </w:pPr>
       <w:r>
         <w:rPr>
@@ -4988,9 +4713,9 @@
     </w:p>
     <w:p>
       <w:pPr>
-        <w:pStyle w:val="Code"/>
         <w:shd w:fill="F2F2F2" w:val="clear"/>
         <w:spacing w:after="0" w:before="0"/>
+        <w:ind w:left="360"/>
       </w:pPr>
       <w:r>
         <w:rPr>
@@ -5003,9 +4728,9 @@
     </w:p>
     <w:p>
       <w:pPr>
-        <w:pStyle w:val="Code"/>
         <w:shd w:fill="F2F2F2" w:val="clear"/>
         <w:spacing w:after="0" w:before="0"/>
+        <w:ind w:left="360"/>
       </w:pPr>
       <w:r>
         <w:rPr>
@@ -5018,9 +4743,9 @@
     </w:p>
     <w:p>
       <w:pPr>
-        <w:pStyle w:val="Code"/>
         <w:shd w:fill="F2F2F2" w:val="clear"/>
         <w:spacing w:after="0" w:before="0"/>
+        <w:ind w:left="360"/>
       </w:pPr>
       <w:r>
         <w:rPr>
@@ -5033,9 +4758,9 @@
     </w:p>
     <w:p>
       <w:pPr>
-        <w:pStyle w:val="Code"/>
         <w:shd w:fill="F2F2F2" w:val="clear"/>
         <w:spacing w:after="0" w:before="0"/>
+        <w:ind w:left="360"/>
       </w:pPr>
       <w:r>
         <w:rPr>
@@ -5048,9 +4773,9 @@
     </w:p>
     <w:p>
       <w:pPr>
-        <w:pStyle w:val="Code"/>
         <w:shd w:fill="F2F2F2" w:val="clear"/>
         <w:spacing w:after="0" w:before="0"/>
+        <w:ind w:left="360"/>
       </w:pPr>
       <w:r>
         <w:rPr>
@@ -5058,14 +4783,14 @@
           <w:sz w:val="18"/>
           <w:szCs w:val="18"/>
         </w:rPr>
-        <w:t xml:space="preserve">    "descIgnoreFilter": "BACKUP-DO-NOT-DELETE"</w:t>
-      </w:r>
-    </w:p>
-    <w:p>
-      <w:pPr>
-        <w:pStyle w:val="Code"/>
+        <w:t xml:space="preserve">    "descIgnoreStrings": ["BACKUP-DO-NOT-DELETE", "DR-HOLD", "KEEP"]</w:t>
+      </w:r>
+    </w:p>
+    <w:p>
+      <w:pPr>
         <w:shd w:fill="F2F2F2" w:val="clear"/>
         <w:spacing w:after="0" w:before="0"/>
+        <w:ind w:left="360"/>
       </w:pPr>
       <w:r>
         <w:rPr>
@@ -5078,9 +4803,9 @@
     </w:p>
     <w:p>
       <w:pPr>
-        <w:pStyle w:val="Code"/>
         <w:shd w:fill="F2F2F2" w:val="clear"/>
         <w:spacing w:after="0" w:before="0"/>
+        <w:ind w:left="360"/>
       </w:pPr>
       <w:r>
         <w:rPr>
@@ -5093,9 +4818,9 @@
     </w:p>
     <w:p>
       <w:pPr>
-        <w:pStyle w:val="Code"/>
         <w:shd w:fill="F2F2F2" w:val="clear"/>
         <w:spacing w:after="0" w:before="0"/>
+        <w:ind w:left="360"/>
       </w:pPr>
       <w:r>
         <w:rPr>
@@ -5108,9 +4833,9 @@
     </w:p>
     <w:p>
       <w:pPr>
-        <w:pStyle w:val="Code"/>
         <w:shd w:fill="F2F2F2" w:val="clear"/>
         <w:spacing w:after="0" w:before="0"/>
+        <w:ind w:left="360"/>
       </w:pPr>
       <w:r>
         <w:rPr>
@@ -5123,9 +4848,9 @@
     </w:p>
     <w:p>
       <w:pPr>
-        <w:pStyle w:val="Code"/>
         <w:shd w:fill="F2F2F2" w:val="clear"/>
         <w:spacing w:after="0" w:before="0"/>
+        <w:ind w:left="360"/>
       </w:pPr>
       <w:r>
         <w:rPr>
@@ -5138,9 +4863,9 @@
     </w:p>
     <w:p>
       <w:pPr>
-        <w:pStyle w:val="Code"/>
         <w:shd w:fill="F2F2F2" w:val="clear"/>
         <w:spacing w:after="0" w:before="0"/>
+        <w:ind w:left="360"/>
       </w:pPr>
       <w:r>
         <w:rPr>
@@ -5153,9 +4878,9 @@
     </w:p>
     <w:p>
       <w:pPr>
-        <w:pStyle w:val="Code"/>
         <w:shd w:fill="F2F2F2" w:val="clear"/>
         <w:spacing w:after="0" w:before="0"/>
+        <w:ind w:left="360"/>
       </w:pPr>
       <w:r>
         <w:rPr>
@@ -5168,9 +4893,9 @@
     </w:p>
     <w:p>
       <w:pPr>
-        <w:pStyle w:val="Code"/>
         <w:shd w:fill="F2F2F2" w:val="clear"/>
         <w:spacing w:after="0" w:before="0"/>
+        <w:ind w:left="360"/>
       </w:pPr>
       <w:r>
         <w:rPr>
@@ -5183,9 +4908,9 @@
     </w:p>
     <w:p>
       <w:pPr>
-        <w:pStyle w:val="Code"/>
         <w:shd w:fill="F2F2F2" w:val="clear"/>
         <w:spacing w:after="0" w:before="0"/>
+        <w:ind w:left="360"/>
       </w:pPr>
       <w:r>
         <w:rPr>
@@ -5234,7 +4959,7 @@
               <w:bottom w:val="single" w:color="BFBFBF" w:sz="4"/>
               <w:right w:val="single" w:color="BFBFBF" w:sz="4"/>
             </w:tcBorders>
-            <w:shd w:fill="1F3864" w:val="clear"/>
+            <w:shd w:fill="0A1F3D" w:val="clear"/>
             <w:tcMar>
               <w:top w:type="dxa" w:w="100"/>
               <w:left w:type="dxa" w:w="140"/>
@@ -5248,11 +4973,12 @@
             </w:pPr>
             <w:r>
               <w:rPr>
+                <w:rFonts w:ascii="Arial" w:cs="Arial" w:eastAsia="Arial" w:hAnsi="Arial"/>
                 <w:b/>
                 <w:bCs/>
                 <w:color w:val="FFFFFF"/>
-                <w:sz w:val="22"/>
-                <w:szCs w:val="22"/>
+                <w:sz w:val="20"/>
+                <w:szCs w:val="20"/>
               </w:rPr>
               <w:t xml:space="preserve">#</w:t>
             </w:r>
@@ -5267,7 +4993,7 @@
               <w:bottom w:val="single" w:color="BFBFBF" w:sz="4"/>
               <w:right w:val="single" w:color="BFBFBF" w:sz="4"/>
             </w:tcBorders>
-            <w:shd w:fill="1F3864" w:val="clear"/>
+            <w:shd w:fill="0A1F3D" w:val="clear"/>
             <w:tcMar>
               <w:top w:type="dxa" w:w="100"/>
               <w:left w:type="dxa" w:w="140"/>
@@ -5281,11 +5007,12 @@
             </w:pPr>
             <w:r>
               <w:rPr>
+                <w:rFonts w:ascii="Arial" w:cs="Arial" w:eastAsia="Arial" w:hAnsi="Arial"/>
                 <w:b/>
                 <w:bCs/>
                 <w:color w:val="FFFFFF"/>
-                <w:sz w:val="22"/>
-                <w:szCs w:val="22"/>
+                <w:sz w:val="20"/>
+                <w:szCs w:val="20"/>
               </w:rPr>
               <w:t xml:space="preserve">Item</w:t>
             </w:r>
@@ -5300,7 +5027,7 @@
               <w:bottom w:val="single" w:color="BFBFBF" w:sz="4"/>
               <w:right w:val="single" w:color="BFBFBF" w:sz="4"/>
             </w:tcBorders>
-            <w:shd w:fill="1F3864" w:val="clear"/>
+            <w:shd w:fill="0A1F3D" w:val="clear"/>
             <w:tcMar>
               <w:top w:type="dxa" w:w="100"/>
               <w:left w:type="dxa" w:w="140"/>
@@ -5314,11 +5041,12 @@
             </w:pPr>
             <w:r>
               <w:rPr>
+                <w:rFonts w:ascii="Arial" w:cs="Arial" w:eastAsia="Arial" w:hAnsi="Arial"/>
                 <w:b/>
                 <w:bCs/>
                 <w:color w:val="FFFFFF"/>
-                <w:sz w:val="22"/>
-                <w:szCs w:val="22"/>
+                <w:sz w:val="20"/>
+                <w:szCs w:val="20"/>
               </w:rPr>
               <w:t xml:space="preserve">Description</w:t>
             </w:r>
@@ -5412,7 +5140,7 @@
                 <w:sz w:val="20"/>
                 <w:szCs w:val="20"/>
               </w:rPr>
-              <w:t xml:space="preserve">ST-07_ProcessPoweredOffVMs.js and adaptiveGovernorCheck.js reference module name "com.company.snapshotcleanup". The canonical names are "com.broadcom.pso.vc.vm.snapshots" (snapshot actions) and "com.broadcom.pso.vc.storage" (storage actions). As shipped, ST-07’s System.getModule calls will fail at runtime. Resolution: rename references in ST-07 to the canonical names before deployment. ST-06 already uses the correct names; use it as the reference.</w:t>
+              <w:t xml:space="preserve">ST-07 and adaptiveGovernorCheck.js reference "com.company.snapshotcleanup". Canonical names are "com.broadcom.pso.vc.vm.snapshots" and "com.broadcom.pso.vc.storage". Must be corrected before deployment.</w:t>
             </w:r>
           </w:p>
         </w:tc>
@@ -5504,7 +5232,7 @@
                 <w:sz w:val="20"/>
                 <w:szCs w:val="20"/>
               </w:rPr>
-              <w:t xml:space="preserve">The action references a configuration element "SnapshotCleanup/FileLogging" which the configuration model explicitly states has been removed. The action is not invoked by any workflow task. Recommendation: delete the file from the action library to avoid confusion, or document it as deprecated.</w:t>
+              <w:t xml:space="preserve">References a removed FileLogging configuration element. Not invoked by any task. Delete or archive.</w:t>
             </w:r>
           </w:p>
         </w:tc>
@@ -5596,7 +5324,7 @@
                 <w:sz w:val="20"/>
                 <w:szCs w:val="20"/>
               </w:rPr>
-              <w:t xml:space="preserve">The pipeline jumps from ST-07 to ST-09 with no ST-08. This is intentional (slot reserved for a future post-processing step such as capacity reporting) but should be either populated or the gap formally closed.</w:t>
+              <w:t xml:space="preserve">Pipeline jumps from ST-07 to ST-09. Intentional placeholder for future post-processing.</w:t>
             </w:r>
           </w:p>
         </w:tc>
@@ -5688,7 +5416,7 @@
                 <w:sz w:val="20"/>
                 <w:szCs w:val="20"/>
               </w:rPr>
-              <w:t xml:space="preserve">Both ST-06 and ST-07 cap governor wait at 120 attempts. With the default 30-second poll interval this is one hour. The cap is hard-coded rather than derived from a workflow input. Consider exposing maxGovernorWaitMinutes as an input.</w:t>
+              <w:t xml:space="preserve">Governor wait capped at 120 attempts. Consider exposing maxGovernorWaitMinutes as an input.</w:t>
             </w:r>
           </w:p>
         </w:tc>
@@ -5780,7 +5508,7 @@
                 <w:sz w:val="20"/>
                 <w:szCs w:val="20"/>
               </w:rPr>
-              <w:t xml:space="preserve">If vRO is killed mid-run, the runLock attribute is left non-empty and all subsequent runs abort. Recovery is a manual edit of the configuration element. Consider adding a TTL stamp (lockAcquiredAt) so the lock can be self-healed if older than a configurable timeout.</w:t>
+              <w:t xml:space="preserve">Consider adding a TTL stamp (lockAcquiredAt) for self-healing.</w:t>
             </w:r>
           </w:p>
         </w:tc>
@@ -5842,7 +5570,7 @@
                 <w:sz w:val="20"/>
                 <w:szCs w:val="20"/>
               </w:rPr>
-              <w:t xml:space="preserve">MoRef matching includes substring fallback</w:t>
+              <w:t xml:space="preserve">MoRef matching workaround</w:t>
             </w:r>
           </w:p>
         </w:tc>
@@ -5872,7 +5600,7 @@
                 <w:sz w:val="20"/>
                 <w:szCs w:val="20"/>
               </w:rPr>
-              <w:t xml:space="preserve">findSnapshot in deleteSnapshot.js attempts several MoRef coercions (string equality, then dash-suffix matching) to handle Polyglot serialisation differences. This is a workaround for a vRO 8.17 behaviour and should be revisited if the runtime is upgraded.</w:t>
+              <w:t xml:space="preserve">findSnapshot includes dash-suffix fallback for Polyglot serialisation. Revisit if vRO runtime is upgraded.</w:t>
             </w:r>
           </w:p>
         </w:tc>
@@ -5880,7 +5608,7 @@
     </w:tbl>
     <w:p>
       <w:pPr>
-        <w:spacing w:after="120"/>
+        <w:spacing w:after="60"/>
       </w:pPr>
       <w:r>
         <w:t xml:space="preserve"> </w:t>
@@ -5907,9 +5635,9 @@
         </w:tblBorders>
       </w:tblPr>
       <w:tblGrid>
-        <w:gridCol w:w="2400"/>
+        <w:gridCol w:w="2600"/>
         <w:gridCol w:w="1500"/>
-        <w:gridCol w:w="5460"/>
+        <w:gridCol w:w="5260"/>
       </w:tblGrid>
       <w:tr>
         <w:trPr>
@@ -5917,14 +5645,14 @@
         </w:trPr>
         <w:tc>
           <w:tcPr>
-            <w:tcW w:type="dxa" w:w="2400"/>
-            <w:tcBorders>
-              <w:top w:val="single" w:color="BFBFBF" w:sz="4"/>
-              <w:left w:val="single" w:color="BFBFBF" w:sz="4"/>
-              <w:bottom w:val="single" w:color="BFBFBF" w:sz="4"/>
-              <w:right w:val="single" w:color="BFBFBF" w:sz="4"/>
-            </w:tcBorders>
-            <w:shd w:fill="1F3864" w:val="clear"/>
+            <w:tcW w:type="dxa" w:w="2600"/>
+            <w:tcBorders>
+              <w:top w:val="single" w:color="BFBFBF" w:sz="4"/>
+              <w:left w:val="single" w:color="BFBFBF" w:sz="4"/>
+              <w:bottom w:val="single" w:color="BFBFBF" w:sz="4"/>
+              <w:right w:val="single" w:color="BFBFBF" w:sz="4"/>
+            </w:tcBorders>
+            <w:shd w:fill="0A1F3D" w:val="clear"/>
             <w:tcMar>
               <w:top w:type="dxa" w:w="100"/>
               <w:left w:type="dxa" w:w="140"/>
@@ -5938,11 +5666,12 @@
             </w:pPr>
             <w:r>
               <w:rPr>
+                <w:rFonts w:ascii="Arial" w:cs="Arial" w:eastAsia="Arial" w:hAnsi="Arial"/>
                 <w:b/>
                 <w:bCs/>
                 <w:color w:val="FFFFFF"/>
-                <w:sz w:val="22"/>
-                <w:szCs w:val="22"/>
+                <w:sz w:val="20"/>
+                <w:szCs w:val="20"/>
               </w:rPr>
               <w:t xml:space="preserve">Outcome</w:t>
             </w:r>
@@ -5957,7 +5686,7 @@
               <w:bottom w:val="single" w:color="BFBFBF" w:sz="4"/>
               <w:right w:val="single" w:color="BFBFBF" w:sz="4"/>
             </w:tcBorders>
-            <w:shd w:fill="1F3864" w:val="clear"/>
+            <w:shd w:fill="0A1F3D" w:val="clear"/>
             <w:tcMar>
               <w:top w:type="dxa" w:w="100"/>
               <w:left w:type="dxa" w:w="140"/>
@@ -5971,11 +5700,12 @@
             </w:pPr>
             <w:r>
               <w:rPr>
+                <w:rFonts w:ascii="Arial" w:cs="Arial" w:eastAsia="Arial" w:hAnsi="Arial"/>
                 <w:b/>
                 <w:bCs/>
                 <w:color w:val="FFFFFF"/>
-                <w:sz w:val="22"/>
-                <w:szCs w:val="22"/>
+                <w:sz w:val="20"/>
+                <w:szCs w:val="20"/>
               </w:rPr>
               <w:t xml:space="preserve">Set by</w:t>
             </w:r>
@@ -5983,14 +5713,14 @@
         </w:tc>
         <w:tc>
           <w:tcPr>
-            <w:tcW w:type="dxa" w:w="5460"/>
-            <w:tcBorders>
-              <w:top w:val="single" w:color="BFBFBF" w:sz="4"/>
-              <w:left w:val="single" w:color="BFBFBF" w:sz="4"/>
-              <w:bottom w:val="single" w:color="BFBFBF" w:sz="4"/>
-              <w:right w:val="single" w:color="BFBFBF" w:sz="4"/>
-            </w:tcBorders>
-            <w:shd w:fill="1F3864" w:val="clear"/>
+            <w:tcW w:type="dxa" w:w="5260"/>
+            <w:tcBorders>
+              <w:top w:val="single" w:color="BFBFBF" w:sz="4"/>
+              <w:left w:val="single" w:color="BFBFBF" w:sz="4"/>
+              <w:bottom w:val="single" w:color="BFBFBF" w:sz="4"/>
+              <w:right w:val="single" w:color="BFBFBF" w:sz="4"/>
+            </w:tcBorders>
+            <w:shd w:fill="0A1F3D" w:val="clear"/>
             <w:tcMar>
               <w:top w:type="dxa" w:w="100"/>
               <w:left w:type="dxa" w:w="140"/>
@@ -6004,11 +5734,12 @@
             </w:pPr>
             <w:r>
               <w:rPr>
+                <w:rFonts w:ascii="Arial" w:cs="Arial" w:eastAsia="Arial" w:hAnsi="Arial"/>
                 <w:b/>
                 <w:bCs/>
                 <w:color w:val="FFFFFF"/>
-                <w:sz w:val="22"/>
-                <w:szCs w:val="22"/>
+                <w:sz w:val="20"/>
+                <w:szCs w:val="20"/>
               </w:rPr>
               <w:t xml:space="preserve">Meaning</w:t>
             </w:r>
@@ -6018,7 +5749,7 @@
       <w:tr>
         <w:tc>
           <w:tcPr>
-            <w:tcW w:type="dxa" w:w="2400"/>
+            <w:tcW w:type="dxa" w:w="2600"/>
             <w:tcBorders>
               <w:top w:val="single" w:color="BFBFBF" w:sz="4"/>
               <w:left w:val="single" w:color="BFBFBF" w:sz="4"/>
@@ -6078,7 +5809,7 @@
         </w:tc>
         <w:tc>
           <w:tcPr>
-            <w:tcW w:type="dxa" w:w="5460"/>
+            <w:tcW w:type="dxa" w:w="5260"/>
             <w:tcBorders>
               <w:top w:val="single" w:color="BFBFBF" w:sz="4"/>
               <w:left w:val="single" w:color="BFBFBF" w:sz="4"/>
@@ -6110,7 +5841,7 @@
       <w:tr>
         <w:tc>
           <w:tcPr>
-            <w:tcW w:type="dxa" w:w="2400"/>
+            <w:tcW w:type="dxa" w:w="2600"/>
             <w:tcBorders>
               <w:top w:val="single" w:color="BFBFBF" w:sz="4"/>
               <w:left w:val="single" w:color="BFBFBF" w:sz="4"/>
@@ -6170,7 +5901,7 @@
         </w:tc>
         <w:tc>
           <w:tcPr>
-            <w:tcW w:type="dxa" w:w="5460"/>
+            <w:tcW w:type="dxa" w:w="5260"/>
             <w:tcBorders>
               <w:top w:val="single" w:color="BFBFBF" w:sz="4"/>
               <w:left w:val="single" w:color="BFBFBF" w:sz="4"/>
@@ -6194,7 +5925,7 @@
                 <w:sz w:val="20"/>
                 <w:szCs w:val="20"/>
               </w:rPr>
-              <w:t xml:space="preserve">Live mode disabled; no deletions performed; counts reflect what would have been done.</w:t>
+              <w:t xml:space="preserve">Live mode disabled; no deletions performed.</w:t>
             </w:r>
           </w:p>
         </w:tc>
@@ -6202,7 +5933,7 @@
       <w:tr>
         <w:tc>
           <w:tcPr>
-            <w:tcW w:type="dxa" w:w="2400"/>
+            <w:tcW w:type="dxa" w:w="2600"/>
             <w:tcBorders>
               <w:top w:val="single" w:color="BFBFBF" w:sz="4"/>
               <w:left w:val="single" w:color="BFBFBF" w:sz="4"/>
@@ -6262,7 +5993,7 @@
         </w:tc>
         <w:tc>
           <w:tcPr>
-            <w:tcW w:type="dxa" w:w="5460"/>
+            <w:tcW w:type="dxa" w:w="5260"/>
             <w:tcBorders>
               <w:top w:val="single" w:color="BFBFBF" w:sz="4"/>
               <w:left w:val="single" w:color="BFBFBF" w:sz="4"/>
@@ -6286,7 +6017,7 @@
                 <w:sz w:val="20"/>
                 <w:szCs w:val="20"/>
               </w:rPr>
-              <w:t xml:space="preserve">Some snapshots could not be processed within the governor wait cap. They will be retried on the next run.</w:t>
+              <w:t xml:space="preserve">Some snapshots could not be processed within the governor wait cap.</w:t>
             </w:r>
           </w:p>
         </w:tc>
@@ -6294,7 +6025,7 @@
       <w:tr>
         <w:tc>
           <w:tcPr>
-            <w:tcW w:type="dxa" w:w="2400"/>
+            <w:tcW w:type="dxa" w:w="2600"/>
             <w:tcBorders>
               <w:top w:val="single" w:color="BFBFBF" w:sz="4"/>
               <w:left w:val="single" w:color="BFBFBF" w:sz="4"/>
@@ -6354,7 +6085,7 @@
         </w:tc>
         <w:tc>
           <w:tcPr>
-            <w:tcW w:type="dxa" w:w="5460"/>
+            <w:tcW w:type="dxa" w:w="5260"/>
             <w:tcBorders>
               <w:top w:val="single" w:color="BFBFBF" w:sz="4"/>
               <w:left w:val="single" w:color="BFBFBF" w:sz="4"/>
@@ -6378,7 +6109,7 @@
                 <w:sz w:val="20"/>
                 <w:szCs w:val="20"/>
               </w:rPr>
-              <w:t xml:space="preserve">One or more deletions returned an error from vCenter. See [FAIL] entries for detail.</w:t>
+              <w:t xml:space="preserve">One or more deletions returned an error from vCenter.</w:t>
             </w:r>
           </w:p>
         </w:tc>
@@ -6386,7 +6117,7 @@
       <w:tr>
         <w:tc>
           <w:tcPr>
-            <w:tcW w:type="dxa" w:w="2400"/>
+            <w:tcW w:type="dxa" w:w="2600"/>
             <w:tcBorders>
               <w:top w:val="single" w:color="BFBFBF" w:sz="4"/>
               <w:left w:val="single" w:color="BFBFBF" w:sz="4"/>
@@ -6446,7 +6177,7 @@
         </w:tc>
         <w:tc>
           <w:tcPr>
-            <w:tcW w:type="dxa" w:w="5460"/>
+            <w:tcW w:type="dxa" w:w="5260"/>
             <w:tcBorders>
               <w:top w:val="single" w:color="BFBFBF" w:sz="4"/>
               <w:left w:val="single" w:color="BFBFBF" w:sz="4"/>
@@ -6470,7 +6201,7 @@
                 <w:sz w:val="20"/>
                 <w:szCs w:val="20"/>
               </w:rPr>
-              <w:t xml:space="preserve">No candidates found; lock released; clean exit via the false branch of the candidates Decision element.</w:t>
+              <w:t xml:space="preserve">No candidates found.</w:t>
             </w:r>
           </w:p>
         </w:tc>
@@ -6478,7 +6209,7 @@
       <w:tr>
         <w:tc>
           <w:tcPr>
-            <w:tcW w:type="dxa" w:w="2400"/>
+            <w:tcW w:type="dxa" w:w="2600"/>
             <w:tcBorders>
               <w:top w:val="single" w:color="BFBFBF" w:sz="4"/>
               <w:left w:val="single" w:color="BFBFBF" w:sz="4"/>
@@ -6538,7 +6269,7 @@
         </w:tc>
         <w:tc>
           <w:tcPr>
-            <w:tcW w:type="dxa" w:w="5460"/>
+            <w:tcW w:type="dxa" w:w="5260"/>
             <w:tcBorders>
               <w:top w:val="single" w:color="BFBFBF" w:sz="4"/>
               <w:left w:val="single" w:color="BFBFBF" w:sz="4"/>
@@ -6562,7 +6293,7 @@
                 <w:sz w:val="20"/>
                 <w:szCs w:val="20"/>
               </w:rPr>
-              <w:t xml:space="preserve">Another run held the lock when this run started. This run took no action and the lock is preserved.</w:t>
+              <w:t xml:space="preserve">Another run held the lock. No action taken.</w:t>
             </w:r>
           </w:p>
         </w:tc>
@@ -6570,7 +6301,7 @@
       <w:tr>
         <w:tc>
           <w:tcPr>
-            <w:tcW w:type="dxa" w:w="2400"/>
+            <w:tcW w:type="dxa" w:w="2600"/>
             <w:tcBorders>
               <w:top w:val="single" w:color="BFBFBF" w:sz="4"/>
               <w:left w:val="single" w:color="BFBFBF" w:sz="4"/>
@@ -6630,7 +6361,7 @@
         </w:tc>
         <w:tc>
           <w:tcPr>
-            <w:tcW w:type="dxa" w:w="5460"/>
+            <w:tcW w:type="dxa" w:w="5260"/>
             <w:tcBorders>
               <w:top w:val="single" w:color="BFBFBF" w:sz="4"/>
               <w:left w:val="single" w:color="BFBFBF" w:sz="4"/>
@@ -6654,7 +6385,7 @@
                 <w:sz w:val="20"/>
                 <w:szCs w:val="20"/>
               </w:rPr>
-              <w:t xml:space="preserve">Sentinel for the no-candidates exit path. ST-04 already wrote the result and released the lock.</w:t>
+              <w:t xml:space="preserve">No-candidates sentinel.</w:t>
             </w:r>
           </w:p>
         </w:tc>
@@ -6662,7 +6393,7 @@
       <w:tr>
         <w:tc>
           <w:tcPr>
-            <w:tcW w:type="dxa" w:w="2400"/>
+            <w:tcW w:type="dxa" w:w="2600"/>
             <w:tcBorders>
               <w:top w:val="single" w:color="BFBFBF" w:sz="4"/>
               <w:left w:val="single" w:color="BFBFBF" w:sz="4"/>
@@ -6722,7 +6453,7 @@
         </w:tc>
         <w:tc>
           <w:tcPr>
-            <w:tcW w:type="dxa" w:w="5460"/>
+            <w:tcW w:type="dxa" w:w="5260"/>
             <w:tcBorders>
               <w:top w:val="single" w:color="BFBFBF" w:sz="4"/>
               <w:left w:val="single" w:color="BFBFBF" w:sz="4"/>
@@ -6746,7 +6477,7 @@
                 <w:sz w:val="20"/>
                 <w:szCs w:val="20"/>
               </w:rPr>
-              <w:t xml:space="preserve">Unexpected exception during execution. Lock released if held by this run; partial results logged; vRO marks run as failed.</w:t>
+              <w:t xml:space="preserve">Unexpected exception. Lock released if held; partial results logged.</w:t>
             </w:r>
           </w:p>
         </w:tc>
@@ -6754,18 +6485,34 @@
     </w:tbl>
     <w:p>
       <w:pPr>
+        <w:spacing w:after="60"/>
+      </w:pPr>
+      <w:r>
+        <w:t xml:space="preserve"> </w:t>
+      </w:r>
+    </w:p>
+    <w:p>
+      <w:pPr>
+        <w:pStyle w:val="Heading1"/>
+      </w:pPr>
+      <w:r>
+        <w:t xml:space="preserve">11. Design Trade-offs</w:t>
+      </w:r>
+    </w:p>
+    <w:p>
+      <w:pPr>
+        <w:pStyle w:val="Heading3"/>
+      </w:pPr>
+      <w:r>
+        <w:t xml:space="preserve">Single workflow vs. one per vCenter</w:t>
+      </w:r>
+    </w:p>
+    <w:p>
+      <w:pPr>
         <w:spacing w:after="120"/>
       </w:pPr>
       <w:r>
-        <w:t xml:space="preserve"> </w:t>
-      </w:r>
-    </w:p>
-    <w:p>
-      <w:pPr>
-        <w:pStyle w:val="Heading1"/>
-      </w:pPr>
-      <w:r>
-        <w:t xml:space="preserve">11. Design Trade-offs</w:t>
+        <w:t xml:space="preserve">A single workflow with a global mutex was chosen over per-vCenter workflows because shared datastores make per-vCenter isolation insufficient.</w:t>
       </w:r>
     </w:p>
     <w:p>
@@ -6773,7 +6520,7 @@
         <w:pStyle w:val="Heading3"/>
       </w:pPr>
       <w:r>
-        <w:t xml:space="preserve">Single workflow vs. one workflow per vCenter</w:t>
+        <w:t xml:space="preserve">Array vs. comma-separated string for descIgnoreStrings</w:t>
       </w:r>
     </w:p>
     <w:p>
@@ -6781,7 +6528,7 @@
         <w:spacing w:after="120"/>
       </w:pPr>
       <w:r>
-        <w:t xml:space="preserve">A single workflow with a global mutex was chosen over per-vCenter workflows because shared datastores (notably stretched vSAN clusters) make per-vCenter isolation insufficient. A run on vc01 could still saturate a datastore that vc02 is also using. The single workflow with cross-lane state inheritance (Section 5.3) is the correct boundary.</w:t>
+        <w:t xml:space="preserve">A native vRO Array/string was chosen over a comma-separated string because array elements can contain commas and special characters, the vRO schedule editor natively supports array inputs, and no parsing or splitting logic is needed at runtime.</w:t>
       </w:r>
     </w:p>
     <w:p>
@@ -6797,7 +6544,7 @@
         <w:spacing w:after="120"/>
       </w:pPr>
       <w:r>
-        <w:t xml:space="preserve">Both ST-06’s harvest loop and _deleteSnapshot’s task wait use polling. vRO 8.17 Polyglot does not expose a reliable VcTask.update() or Server.getTask() API. Polling delTask.info every 5 seconds (which re-fetches transparently in Polyglot) was chosen over a more elaborate event subscription, with confirmation via VM snapshot list as a backstop if delTask.info access fails.</w:t>
+        <w:t xml:space="preserve">vRO 8.17 Polyglot does not expose a reliable VcTask.update() API. Polling delTask.info every 5 seconds was chosen with confirmation via VM snapshot list as a backstop.</w:t>
       </w:r>
     </w:p>
     <w:p>
@@ -6805,7 +6552,7 @@
         <w:pStyle w:val="Heading3"/>
       </w:pPr>
       <w:r>
-        <w:t xml:space="preserve">Hold-and-defer vs. retry-with-backoff</w:t>
+        <w:t xml:space="preserve">All thresholds as workflow inputs</w:t>
       </w:r>
     </w:p>
     <w:p>
@@ -6813,23 +6560,7 @@
         <w:spacing w:after="120"/>
       </w:pPr>
       <w:r>
-        <w:t xml:space="preserve">When the governor times out a candidate is logged as deferred and skipped for this run, rather than retried with exponential backoff later in the same run. Reasons: keeps each run’s wall-clock bounded; surfaces persistent storage problems immediately rather than masking them; and the next scheduled run will retry naturally.</w:t>
-      </w:r>
-    </w:p>
-    <w:p>
-      <w:pPr>
-        <w:pStyle w:val="Heading3"/>
-      </w:pPr>
-      <w:r>
-        <w:t xml:space="preserve">All thresholds as workflow inputs</w:t>
-      </w:r>
-    </w:p>
-    <w:p>
-      <w:pPr>
-        <w:spacing w:after="120"/>
-      </w:pPr>
-      <w:r>
-        <w:t xml:space="preserve">An earlier draft used a separate Thresholds configuration element. This was dropped in favour of workflow inputs with defaults on the Inputs tab so the entire policy is visible inside the workflow itself. It also lets schedules override defaults per environment without editing a global config element.</w:t>
+        <w:t xml:space="preserve">Keeps the entire policy visible inside the workflow. Lets schedules override defaults per environment without editing a global config element.</w:t>
       </w:r>
     </w:p>
     <w:p>
@@ -6863,7 +6594,7 @@
         <w:spacing w:after="80"/>
       </w:pPr>
       <w:r>
-        <w:t xml:space="preserve">ST-08: optional capacity reclamation summary that diffs datastore free space against the previous run.</w:t>
+        <w:t xml:space="preserve">ST-08: optional capacity reclamation summary.</w:t>
       </w:r>
     </w:p>
     <w:p>
@@ -6876,7 +6607,7 @@
         <w:spacing w:after="80"/>
       </w:pPr>
       <w:r>
-        <w:t xml:space="preserve">Self-healing lock via TTL timestamp (see issue 9.5).</w:t>
+        <w:t xml:space="preserve">Self-healing lock via TTL timestamp.</w:t>
       </w:r>
     </w:p>
     <w:p>
@@ -6889,20 +6620,7 @@
         <w:spacing w:after="80"/>
       </w:pPr>
       <w:r>
-        <w:t xml:space="preserve">Slack/Teams notification action wired into ST-09 result emission.</w:t>
-      </w:r>
-    </w:p>
-    <w:p>
-      <w:pPr>
-        <w:pStyle w:val="ListParagraph"/>
-        <w:numPr>
-          <w:ilvl w:val="0"/>
-          <w:numId w:val="2"/>
-        </w:numPr>
-        <w:spacing w:after="80"/>
-      </w:pPr>
-      <w:r>
-        <w:t xml:space="preserve">Address the issues catalogued in Section 9 before each release.</w:t>
+        <w:t xml:space="preserve">Slack/Teams notification action wired into ST-09.</w:t>
       </w:r>
     </w:p>
     <w:sectPr>
@@ -6966,7 +6684,8 @@
     </w:pPr>
     <w:r>
       <w:rPr>
-        <w:color w:val="595959"/>
+        <w:rFonts w:ascii="Arial" w:cs="Arial" w:eastAsia="Arial" w:hAnsi="Arial"/>
+        <w:color w:val="404040"/>
         <w:sz w:val="18"/>
         <w:szCs w:val="18"/>
       </w:rPr>
@@ -6974,7 +6693,7 @@
     </w:r>
     <w:r>
       <w:rPr>
-        <w:color w:val="595959"/>
+        <w:color w:val="404040"/>
         <w:sz w:val="18"/>
         <w:szCs w:val="18"/>
       </w:rPr>
@@ -6985,7 +6704,8 @@
     </w:r>
     <w:r>
       <w:rPr>
-        <w:color w:val="595959"/>
+        <w:rFonts w:ascii="Arial" w:cs="Arial" w:eastAsia="Arial" w:hAnsi="Arial"/>
+        <w:color w:val="404040"/>
         <w:sz w:val="18"/>
         <w:szCs w:val="18"/>
       </w:rPr>
@@ -6993,7 +6713,7 @@
     </w:r>
     <w:r>
       <w:rPr>
-        <w:color w:val="595959"/>
+        <w:color w:val="404040"/>
         <w:sz w:val="18"/>
         <w:szCs w:val="18"/>
       </w:rPr>
@@ -7048,7 +6768,7 @@
   <w:p>
     <w:pPr>
       <w:pBdr>
-        <w:bottom w:val="single" w:color="2E75B6" w:sz="6" w:space="4"/>
+        <w:bottom w:val="single" w:color="BFBFBF" w:sz="4" w:space="4"/>
       </w:pBdr>
       <w:tabs>
         <w:tab w:val="right" w:pos="9026"/>
@@ -7056,7 +6776,8 @@
     </w:pPr>
     <w:r>
       <w:rPr>
-        <w:color w:val="595959"/>
+        <w:rFonts w:ascii="Arial" w:cs="Arial" w:eastAsia="Arial" w:hAnsi="Arial"/>
+        <w:color w:val="404040"/>
         <w:sz w:val="18"/>
         <w:szCs w:val="18"/>
       </w:rPr>
@@ -7064,9 +6785,10 @@
     </w:r>
     <w:r>
       <w:rPr>
+        <w:rFonts w:ascii="Arial" w:cs="Arial" w:eastAsia="Arial" w:hAnsi="Arial"/>
         <w:i/>
         <w:iCs/>
-        <w:color w:val="595959"/>
+        <w:color w:val="404040"/>
         <w:sz w:val="18"/>
         <w:szCs w:val="18"/>
       </w:rPr>
@@ -7221,7 +6943,8 @@
   <w:docDefaults>
     <w:rPrDefault>
       <w:rPr>
-        <w:rFonts w:ascii="Calibri" w:cs="Calibri" w:eastAsia="Calibri" w:hAnsi="Calibri"/>
+        <w:rFonts w:ascii="Arial" w:cs="Arial" w:eastAsia="Arial" w:hAnsi="Arial"/>
+        <w:color w:val="1F1F1F"/>
         <w:sz w:val="22"/>
         <w:szCs w:val="22"/>
       </w:rPr>
@@ -7399,39 +7122,6 @@
       <w:szCs w:val="20"/>
     </w:rPr>
   </w:style>
-  <w:style w:type="paragraph" w:styleId="Title">
-    <w:name w:val="Title"/>
-    <w:basedOn w:val="Normal"/>
-    <w:next w:val="Normal"/>
-    <w:qFormat/>
-    <w:pPr>
-      <w:spacing w:after="120" w:before="0"/>
-    </w:pPr>
-    <w:rPr>
-      <w:rFonts w:ascii="Calibri" w:cs="Calibri" w:eastAsia="Calibri" w:hAnsi="Calibri"/>
-      <w:b/>
-      <w:bCs/>
-      <w:color w:val="1F3864"/>
-      <w:sz w:val="56"/>
-      <w:szCs w:val="56"/>
-    </w:rPr>
-  </w:style>
-  <w:style w:type="paragraph" w:styleId="Subtitle">
-    <w:name w:val="Subtitle"/>
-    <w:basedOn w:val="Normal"/>
-    <w:next w:val="Normal"/>
-    <w:pPr>
-      <w:spacing w:after="480" w:before="0"/>
-    </w:pPr>
-    <w:rPr>
-      <w:rFonts w:ascii="Calibri" w:cs="Calibri" w:eastAsia="Calibri" w:hAnsi="Calibri"/>
-      <w:i/>
-      <w:iCs/>
-      <w:color w:val="595959"/>
-      <w:sz w:val="28"/>
-      <w:szCs w:val="28"/>
-    </w:rPr>
-  </w:style>
   <w:style w:type="paragraph" w:styleId="Heading1">
     <w:name w:val="Heading 1"/>
     <w:basedOn w:val="Normal"/>
@@ -7439,18 +7129,18 @@
     <w:qFormat/>
     <w:pPr>
       <w:pBdr>
-        <w:bottom w:val="single" w:color="2E75B6" w:sz="8" w:space="4"/>
+        <w:bottom w:val="single" w:color="1565C0" w:sz="6" w:space="4"/>
       </w:pBdr>
       <w:spacing w:after="180" w:before="360"/>
       <w:outlineLvl w:val="0"/>
     </w:pPr>
     <w:rPr>
-      <w:rFonts w:ascii="Calibri" w:cs="Calibri" w:eastAsia="Calibri" w:hAnsi="Calibri"/>
+      <w:rFonts w:ascii="Arial" w:cs="Arial" w:eastAsia="Arial" w:hAnsi="Arial"/>
       <w:b/>
       <w:bCs/>
-      <w:color w:val="1F3864"/>
-      <w:sz w:val="36"/>
-      <w:szCs w:val="36"/>
+      <w:color w:val="0A1F3D"/>
+      <w:sz w:val="32"/>
+      <w:szCs w:val="32"/>
     </w:rPr>
   </w:style>
   <w:style w:type="paragraph" w:styleId="Heading2">
@@ -7463,12 +7153,12 @@
       <w:outlineLvl w:val="1"/>
     </w:pPr>
     <w:rPr>
-      <w:rFonts w:ascii="Calibri" w:cs="Calibri" w:eastAsia="Calibri" w:hAnsi="Calibri"/>
+      <w:rFonts w:ascii="Arial" w:cs="Arial" w:eastAsia="Arial" w:hAnsi="Arial"/>
       <w:b/>
       <w:bCs/>
-      <w:color w:val="1F3864"/>
-      <w:sz w:val="28"/>
-      <w:szCs w:val="28"/>
+      <w:color w:val="0A1F3D"/>
+      <w:sz w:val="26"/>
+      <w:szCs w:val="26"/>
     </w:rPr>
   </w:style>
   <w:style w:type="paragraph" w:styleId="Heading3">
@@ -7481,26 +7171,12 @@
       <w:outlineLvl w:val="2"/>
     </w:pPr>
     <w:rPr>
-      <w:rFonts w:ascii="Calibri" w:cs="Calibri" w:eastAsia="Calibri" w:hAnsi="Calibri"/>
+      <w:rFonts w:ascii="Arial" w:cs="Arial" w:eastAsia="Arial" w:hAnsi="Arial"/>
       <w:b/>
       <w:bCs/>
-      <w:color w:val="2E75B6"/>
-      <w:sz w:val="24"/>
-      <w:szCs w:val="24"/>
-    </w:rPr>
-  </w:style>
-  <w:style w:type="paragraph" w:styleId="Code">
-    <w:name w:val="Code"/>
-    <w:basedOn w:val="Normal"/>
-    <w:next w:val="Normal"/>
-    <w:pPr>
-      <w:spacing w:after="80" w:before="80"/>
-    </w:pPr>
-    <w:rPr>
-      <w:rFonts w:ascii="Consolas" w:cs="Consolas" w:eastAsia="Consolas" w:hAnsi="Consolas"/>
-      <w:color w:val="1F1F1F"/>
-      <w:sz w:val="18"/>
-      <w:szCs w:val="18"/>
+      <w:color w:val="1565C0"/>
+      <w:sz w:val="22"/>
+      <w:szCs w:val="22"/>
     </w:rPr>
   </w:style>
 </w:styles>

</xml_diff>